<commit_message>
Improve bulk QR printing with better layout and documentation
- Enhance print-bulk-qr.blade.php layout for better QR code display
- Update documentation in modul-penggunaan-inventaris-it.docx
- Improve print formatting and user experience

🤖 Generated with [Claude Code](https://claude.com/claude-code)

Co-Authored-By: Claude <noreply@anthropic.com>
</commit_message>
<xml_diff>
--- a/modul-penggunaan-inventaris-it.docx
+++ b/modul-penggunaan-inventaris-it.docx
@@ -6,68 +6,87 @@
       <w:pPr>
         <w:jc w:val="center"/>
         <w:rPr>
+          <w:rFonts w:ascii="Times New Roman" w:hAnsi="Times New Roman" w:cs="Times New Roman"/>
           <w:b/>
           <w:bCs/>
           <w:sz w:val="28"/>
           <w:szCs w:val="28"/>
         </w:rPr>
       </w:pPr>
-      <w:r>
-        <w:rPr>
-          <w:rFonts w:ascii="Helvetica Light" w:hAnsi="Helvetica Light" w:cs="Helvetica Light"/>
+      <w:proofErr w:type="spellStart"/>
+      <w:r>
+        <w:rPr>
+          <w:rFonts w:ascii="Times New Roman" w:hAnsi="Times New Roman" w:cs="Times New Roman"/>
           <w:b/>
           <w:bCs/>
           <w:sz w:val="28"/>
           <w:szCs w:val="28"/>
         </w:rPr>
-        <w:t xml:space="preserve">Modul </w:t>
-      </w:r>
-      <w:proofErr w:type="spellStart"/>
-      <w:r>
-        <w:rPr>
-          <w:rFonts w:ascii="Helvetica Light" w:hAnsi="Helvetica Light" w:cs="Helvetica Light"/>
+        <w:t>Dokumentasi</w:t>
+      </w:r>
+      <w:proofErr w:type="spellEnd"/>
+      <w:r>
+        <w:rPr>
+          <w:rFonts w:ascii="Times New Roman" w:hAnsi="Times New Roman" w:cs="Times New Roman"/>
           <w:b/>
           <w:bCs/>
           <w:sz w:val="28"/>
           <w:szCs w:val="28"/>
         </w:rPr>
-        <w:t>Penggunaan</w:t>
-      </w:r>
-      <w:proofErr w:type="spellEnd"/>
-      <w:r>
-        <w:rPr>
-          <w:rFonts w:ascii="Helvetica Light" w:hAnsi="Helvetica Light" w:cs="Helvetica Light"/>
+        <w:t xml:space="preserve"> </w:t>
+      </w:r>
+      <w:proofErr w:type="spellStart"/>
+      <w:r>
+        <w:rPr>
+          <w:rFonts w:ascii="Times New Roman" w:hAnsi="Times New Roman" w:cs="Times New Roman"/>
           <w:b/>
           <w:bCs/>
           <w:sz w:val="28"/>
           <w:szCs w:val="28"/>
         </w:rPr>
-        <w:t xml:space="preserve"> Web </w:t>
-      </w:r>
-      <w:proofErr w:type="spellStart"/>
-      <w:r>
-        <w:rPr>
-          <w:rFonts w:ascii="Helvetica Light" w:hAnsi="Helvetica Light" w:cs="Helvetica Light"/>
+        <w:t>Penggunaan</w:t>
+      </w:r>
+      <w:proofErr w:type="spellEnd"/>
+      <w:r>
+        <w:rPr>
+          <w:rFonts w:ascii="Times New Roman" w:hAnsi="Times New Roman" w:cs="Times New Roman"/>
           <w:b/>
           <w:bCs/>
           <w:sz w:val="28"/>
           <w:szCs w:val="28"/>
         </w:rPr>
-        <w:t>Inventaris</w:t>
-      </w:r>
-      <w:proofErr w:type="spellEnd"/>
-      <w:r>
-        <w:rPr>
-          <w:rFonts w:ascii="Helvetica Light" w:hAnsi="Helvetica Light" w:cs="Helvetica Light"/>
+        <w:t xml:space="preserve"> Web </w:t>
+      </w:r>
+      <w:proofErr w:type="spellStart"/>
+      <w:r>
+        <w:rPr>
+          <w:rFonts w:ascii="Times New Roman" w:hAnsi="Times New Roman" w:cs="Times New Roman"/>
           <w:b/>
           <w:bCs/>
           <w:sz w:val="28"/>
           <w:szCs w:val="28"/>
         </w:rPr>
+        <w:t>Inventaris</w:t>
+      </w:r>
+      <w:proofErr w:type="spellEnd"/>
+      <w:r>
+        <w:rPr>
+          <w:rFonts w:ascii="Times New Roman" w:hAnsi="Times New Roman" w:cs="Times New Roman"/>
+          <w:b/>
+          <w:bCs/>
+          <w:sz w:val="28"/>
+          <w:szCs w:val="28"/>
+        </w:rPr>
         <w:t xml:space="preserve"> IT</w:t>
       </w:r>
     </w:p>
-    <w:p/>
+    <w:p>
+      <w:pPr>
+        <w:rPr>
+          <w:rFonts w:ascii="Times New Roman" w:hAnsi="Times New Roman" w:cs="Times New Roman"/>
+        </w:rPr>
+      </w:pPr>
+    </w:p>
     <w:p>
       <w:pPr>
         <w:pStyle w:val="ListParagraph"/>
@@ -76,34 +95,43 @@
           <w:numId w:val="1"/>
         </w:numPr>
         <w:rPr>
+          <w:rFonts w:ascii="Times New Roman" w:hAnsi="Times New Roman" w:cs="Times New Roman"/>
           <w:b/>
           <w:bCs/>
-        </w:rPr>
-      </w:pPr>
-      <w:proofErr w:type="spellStart"/>
-      <w:r>
-        <w:rPr>
-          <w:rFonts w:ascii="Helvetica Light" w:hAnsi="Helvetica Light" w:cs="Helvetica Light"/>
+          <w:sz w:val="26"/>
+          <w:szCs w:val="26"/>
+        </w:rPr>
+      </w:pPr>
+      <w:proofErr w:type="spellStart"/>
+      <w:r>
+        <w:rPr>
+          <w:rFonts w:ascii="Times New Roman" w:hAnsi="Times New Roman" w:cs="Times New Roman"/>
           <w:b/>
           <w:bCs/>
+          <w:sz w:val="26"/>
+          <w:szCs w:val="26"/>
         </w:rPr>
         <w:t>Fungsi</w:t>
       </w:r>
       <w:proofErr w:type="spellEnd"/>
       <w:r>
         <w:rPr>
-          <w:rFonts w:ascii="Helvetica Light" w:hAnsi="Helvetica Light" w:cs="Helvetica Light"/>
+          <w:rFonts w:ascii="Times New Roman" w:hAnsi="Times New Roman" w:cs="Times New Roman"/>
           <w:b/>
           <w:bCs/>
-        </w:rPr>
-        <w:t xml:space="preserve"> </w:t>
-      </w:r>
-      <w:proofErr w:type="spellStart"/>
-      <w:r>
-        <w:rPr>
-          <w:rFonts w:ascii="Helvetica Light" w:hAnsi="Helvetica Light" w:cs="Helvetica Light"/>
+          <w:sz w:val="26"/>
+          <w:szCs w:val="26"/>
+        </w:rPr>
+        <w:t xml:space="preserve"> </w:t>
+      </w:r>
+      <w:proofErr w:type="spellStart"/>
+      <w:r>
+        <w:rPr>
+          <w:rFonts w:ascii="Times New Roman" w:hAnsi="Times New Roman" w:cs="Times New Roman"/>
           <w:b/>
           <w:bCs/>
+          <w:sz w:val="26"/>
+          <w:szCs w:val="26"/>
         </w:rPr>
         <w:t>Sistem</w:t>
       </w:r>
@@ -111,414 +139,422 @@
     </w:p>
     <w:p>
       <w:pPr>
+        <w:ind w:left="360"/>
         <w:jc w:val="both"/>
-      </w:pPr>
-      <w:r>
-        <w:rPr>
-          <w:rFonts w:ascii="Helvetica Light" w:hAnsi="Helvetica Light" w:cs="Helvetica Light"/>
+        <w:rPr>
+          <w:rFonts w:ascii="Times New Roman" w:hAnsi="Times New Roman" w:cs="Times New Roman"/>
+        </w:rPr>
+      </w:pPr>
+      <w:r>
+        <w:rPr>
+          <w:rFonts w:ascii="Times New Roman" w:hAnsi="Times New Roman" w:cs="Times New Roman"/>
         </w:rPr>
         <w:t xml:space="preserve">Web </w:t>
       </w:r>
       <w:proofErr w:type="spellStart"/>
       <w:r>
         <w:rPr>
-          <w:rFonts w:ascii="Helvetica Light" w:hAnsi="Helvetica Light" w:cs="Helvetica Light"/>
+          <w:rFonts w:ascii="Times New Roman" w:hAnsi="Times New Roman" w:cs="Times New Roman"/>
         </w:rPr>
         <w:t>ini</w:t>
       </w:r>
       <w:proofErr w:type="spellEnd"/>
       <w:r>
         <w:rPr>
-          <w:rFonts w:ascii="Helvetica Light" w:hAnsi="Helvetica Light" w:cs="Helvetica Light"/>
-        </w:rPr>
-        <w:t xml:space="preserve"> </w:t>
-      </w:r>
-      <w:proofErr w:type="spellStart"/>
-      <w:r>
-        <w:rPr>
-          <w:rFonts w:ascii="Helvetica Light" w:hAnsi="Helvetica Light" w:cs="Helvetica Light"/>
+          <w:rFonts w:ascii="Times New Roman" w:hAnsi="Times New Roman" w:cs="Times New Roman"/>
+        </w:rPr>
+        <w:t xml:space="preserve"> </w:t>
+      </w:r>
+      <w:proofErr w:type="spellStart"/>
+      <w:r>
+        <w:rPr>
+          <w:rFonts w:ascii="Times New Roman" w:hAnsi="Times New Roman" w:cs="Times New Roman"/>
         </w:rPr>
         <w:t>adalah</w:t>
       </w:r>
       <w:proofErr w:type="spellEnd"/>
       <w:r>
         <w:rPr>
-          <w:rFonts w:ascii="Helvetica Light" w:hAnsi="Helvetica Light" w:cs="Helvetica Light"/>
-        </w:rPr>
-        <w:t xml:space="preserve"> </w:t>
-      </w:r>
-      <w:proofErr w:type="spellStart"/>
-      <w:r>
-        <w:rPr>
-          <w:rFonts w:ascii="Helvetica Light" w:hAnsi="Helvetica Light" w:cs="Helvetica Light"/>
+          <w:rFonts w:ascii="Times New Roman" w:hAnsi="Times New Roman" w:cs="Times New Roman"/>
+        </w:rPr>
+        <w:t xml:space="preserve"> </w:t>
+      </w:r>
+      <w:proofErr w:type="spellStart"/>
+      <w:r>
+        <w:rPr>
+          <w:rFonts w:ascii="Times New Roman" w:hAnsi="Times New Roman" w:cs="Times New Roman"/>
         </w:rPr>
         <w:t>sistem</w:t>
       </w:r>
       <w:proofErr w:type="spellEnd"/>
       <w:r>
         <w:rPr>
-          <w:rFonts w:ascii="Helvetica Light" w:hAnsi="Helvetica Light" w:cs="Helvetica Light"/>
-        </w:rPr>
-        <w:t xml:space="preserve"> </w:t>
-      </w:r>
-      <w:proofErr w:type="spellStart"/>
-      <w:r>
-        <w:rPr>
-          <w:rFonts w:ascii="Helvetica Light" w:hAnsi="Helvetica Light" w:cs="Helvetica Light"/>
+          <w:rFonts w:ascii="Times New Roman" w:hAnsi="Times New Roman" w:cs="Times New Roman"/>
+        </w:rPr>
+        <w:t xml:space="preserve"> </w:t>
+      </w:r>
+      <w:proofErr w:type="spellStart"/>
+      <w:r>
+        <w:rPr>
+          <w:rFonts w:ascii="Times New Roman" w:hAnsi="Times New Roman" w:cs="Times New Roman"/>
         </w:rPr>
         <w:t>inventaris</w:t>
       </w:r>
       <w:proofErr w:type="spellEnd"/>
       <w:r>
         <w:rPr>
-          <w:rFonts w:ascii="Helvetica Light" w:hAnsi="Helvetica Light" w:cs="Helvetica Light"/>
+          <w:rFonts w:ascii="Times New Roman" w:hAnsi="Times New Roman" w:cs="Times New Roman"/>
         </w:rPr>
         <w:t xml:space="preserve"> internal </w:t>
       </w:r>
       <w:proofErr w:type="spellStart"/>
       <w:r>
         <w:rPr>
-          <w:rFonts w:ascii="Helvetica Light" w:hAnsi="Helvetica Light" w:cs="Helvetica Light"/>
+          <w:rFonts w:ascii="Times New Roman" w:hAnsi="Times New Roman" w:cs="Times New Roman"/>
         </w:rPr>
         <w:t>untuk</w:t>
       </w:r>
       <w:proofErr w:type="spellEnd"/>
       <w:r>
         <w:rPr>
-          <w:rFonts w:ascii="Helvetica Light" w:hAnsi="Helvetica Light" w:cs="Helvetica Light"/>
-        </w:rPr>
-        <w:t xml:space="preserve"> </w:t>
-      </w:r>
-      <w:proofErr w:type="spellStart"/>
-      <w:r>
-        <w:rPr>
-          <w:rFonts w:ascii="Helvetica Light" w:hAnsi="Helvetica Light" w:cs="Helvetica Light"/>
+          <w:rFonts w:ascii="Times New Roman" w:hAnsi="Times New Roman" w:cs="Times New Roman"/>
+        </w:rPr>
+        <w:t xml:space="preserve"> </w:t>
+      </w:r>
+      <w:proofErr w:type="spellStart"/>
+      <w:r>
+        <w:rPr>
+          <w:rFonts w:ascii="Times New Roman" w:hAnsi="Times New Roman" w:cs="Times New Roman"/>
         </w:rPr>
         <w:t>mencatat</w:t>
       </w:r>
       <w:proofErr w:type="spellEnd"/>
       <w:r>
         <w:rPr>
-          <w:rFonts w:ascii="Helvetica Light" w:hAnsi="Helvetica Light" w:cs="Helvetica Light"/>
+          <w:rFonts w:ascii="Times New Roman" w:hAnsi="Times New Roman" w:cs="Times New Roman"/>
         </w:rPr>
         <w:t xml:space="preserve"> dan </w:t>
       </w:r>
       <w:proofErr w:type="spellStart"/>
       <w:r>
         <w:rPr>
-          <w:rFonts w:ascii="Helvetica Light" w:hAnsi="Helvetica Light" w:cs="Helvetica Light"/>
+          <w:rFonts w:ascii="Times New Roman" w:hAnsi="Times New Roman" w:cs="Times New Roman"/>
         </w:rPr>
         <w:t>memantau</w:t>
       </w:r>
       <w:proofErr w:type="spellEnd"/>
       <w:r>
         <w:rPr>
-          <w:rFonts w:ascii="Helvetica Light" w:hAnsi="Helvetica Light" w:cs="Helvetica Light"/>
+          <w:rFonts w:ascii="Times New Roman" w:hAnsi="Times New Roman" w:cs="Times New Roman"/>
         </w:rPr>
         <w:t xml:space="preserve"> asset IT </w:t>
       </w:r>
       <w:proofErr w:type="spellStart"/>
       <w:r>
         <w:rPr>
-          <w:rFonts w:ascii="Helvetica Light" w:hAnsi="Helvetica Light" w:cs="Helvetica Light"/>
+          <w:rFonts w:ascii="Times New Roman" w:hAnsi="Times New Roman" w:cs="Times New Roman"/>
         </w:rPr>
         <w:t>Yulie</w:t>
       </w:r>
       <w:proofErr w:type="spellEnd"/>
       <w:r>
         <w:rPr>
-          <w:rFonts w:ascii="Helvetica Light" w:hAnsi="Helvetica Light" w:cs="Helvetica Light"/>
-        </w:rPr>
-        <w:t xml:space="preserve"> </w:t>
-      </w:r>
-      <w:proofErr w:type="spellStart"/>
-      <w:r>
-        <w:rPr>
-          <w:rFonts w:ascii="Helvetica Light" w:hAnsi="Helvetica Light" w:cs="Helvetica Light"/>
+          <w:rFonts w:ascii="Times New Roman" w:hAnsi="Times New Roman" w:cs="Times New Roman"/>
+        </w:rPr>
+        <w:t xml:space="preserve"> </w:t>
+      </w:r>
+      <w:proofErr w:type="spellStart"/>
+      <w:r>
+        <w:rPr>
+          <w:rFonts w:ascii="Times New Roman" w:hAnsi="Times New Roman" w:cs="Times New Roman"/>
         </w:rPr>
         <w:t>Sekuritas</w:t>
       </w:r>
       <w:proofErr w:type="spellEnd"/>
       <w:r>
         <w:rPr>
-          <w:rFonts w:ascii="Helvetica Light" w:hAnsi="Helvetica Light" w:cs="Helvetica Light"/>
+          <w:rFonts w:ascii="Times New Roman" w:hAnsi="Times New Roman" w:cs="Times New Roman"/>
         </w:rPr>
         <w:t xml:space="preserve">. </w:t>
       </w:r>
       <w:proofErr w:type="spellStart"/>
       <w:r>
         <w:rPr>
-          <w:rFonts w:ascii="Helvetica Light" w:hAnsi="Helvetica Light" w:cs="Helvetica Light"/>
+          <w:rFonts w:ascii="Times New Roman" w:hAnsi="Times New Roman" w:cs="Times New Roman"/>
         </w:rPr>
         <w:t>Sistem</w:t>
       </w:r>
       <w:proofErr w:type="spellEnd"/>
       <w:r>
         <w:rPr>
-          <w:rFonts w:ascii="Helvetica Light" w:hAnsi="Helvetica Light" w:cs="Helvetica Light"/>
-        </w:rPr>
-        <w:t xml:space="preserve"> </w:t>
-      </w:r>
-      <w:proofErr w:type="spellStart"/>
-      <w:r>
-        <w:rPr>
-          <w:rFonts w:ascii="Helvetica Light" w:hAnsi="Helvetica Light" w:cs="Helvetica Light"/>
+          <w:rFonts w:ascii="Times New Roman" w:hAnsi="Times New Roman" w:cs="Times New Roman"/>
+        </w:rPr>
+        <w:t xml:space="preserve"> </w:t>
+      </w:r>
+      <w:proofErr w:type="spellStart"/>
+      <w:r>
+        <w:rPr>
+          <w:rFonts w:ascii="Times New Roman" w:hAnsi="Times New Roman" w:cs="Times New Roman"/>
         </w:rPr>
         <w:t>dipakai</w:t>
       </w:r>
       <w:proofErr w:type="spellEnd"/>
       <w:r>
         <w:rPr>
-          <w:rFonts w:ascii="Helvetica Light" w:hAnsi="Helvetica Light" w:cs="Helvetica Light"/>
-        </w:rPr>
-        <w:t xml:space="preserve"> </w:t>
-      </w:r>
-      <w:proofErr w:type="spellStart"/>
-      <w:r>
-        <w:rPr>
-          <w:rFonts w:ascii="Helvetica Light" w:hAnsi="Helvetica Light" w:cs="Helvetica Light"/>
+          <w:rFonts w:ascii="Times New Roman" w:hAnsi="Times New Roman" w:cs="Times New Roman"/>
+        </w:rPr>
+        <w:t xml:space="preserve"> </w:t>
+      </w:r>
+      <w:proofErr w:type="spellStart"/>
+      <w:r>
+        <w:rPr>
+          <w:rFonts w:ascii="Times New Roman" w:hAnsi="Times New Roman" w:cs="Times New Roman"/>
         </w:rPr>
         <w:t>untuk</w:t>
       </w:r>
       <w:proofErr w:type="spellEnd"/>
       <w:r>
         <w:rPr>
-          <w:rFonts w:ascii="Helvetica Light" w:hAnsi="Helvetica Light" w:cs="Helvetica Light"/>
-        </w:rPr>
-        <w:t xml:space="preserve"> </w:t>
-      </w:r>
-      <w:proofErr w:type="spellStart"/>
-      <w:r>
-        <w:rPr>
-          <w:rFonts w:ascii="Helvetica Light" w:hAnsi="Helvetica Light" w:cs="Helvetica Light"/>
+          <w:rFonts w:ascii="Times New Roman" w:hAnsi="Times New Roman" w:cs="Times New Roman"/>
+        </w:rPr>
+        <w:t xml:space="preserve"> </w:t>
+      </w:r>
+      <w:proofErr w:type="spellStart"/>
+      <w:r>
+        <w:rPr>
+          <w:rFonts w:ascii="Times New Roman" w:hAnsi="Times New Roman" w:cs="Times New Roman"/>
         </w:rPr>
         <w:t>mengelola</w:t>
       </w:r>
       <w:proofErr w:type="spellEnd"/>
       <w:r>
         <w:rPr>
-          <w:rFonts w:ascii="Helvetica Light" w:hAnsi="Helvetica Light" w:cs="Helvetica Light"/>
-        </w:rPr>
-        <w:t xml:space="preserve"> </w:t>
-      </w:r>
-      <w:proofErr w:type="spellStart"/>
-      <w:r>
-        <w:rPr>
-          <w:rFonts w:ascii="Helvetica Light" w:hAnsi="Helvetica Light" w:cs="Helvetica Light"/>
+          <w:rFonts w:ascii="Times New Roman" w:hAnsi="Times New Roman" w:cs="Times New Roman"/>
+        </w:rPr>
+        <w:t xml:space="preserve"> </w:t>
+      </w:r>
+      <w:proofErr w:type="spellStart"/>
+      <w:r>
+        <w:rPr>
+          <w:rFonts w:ascii="Times New Roman" w:hAnsi="Times New Roman" w:cs="Times New Roman"/>
         </w:rPr>
         <w:t>kategori</w:t>
       </w:r>
       <w:proofErr w:type="spellEnd"/>
       <w:r>
         <w:rPr>
-          <w:rFonts w:ascii="Helvetica Light" w:hAnsi="Helvetica Light" w:cs="Helvetica Light"/>
+          <w:rFonts w:ascii="Times New Roman" w:hAnsi="Times New Roman" w:cs="Times New Roman"/>
         </w:rPr>
         <w:t xml:space="preserve">, data asset, status </w:t>
       </w:r>
       <w:proofErr w:type="spellStart"/>
       <w:r>
         <w:rPr>
-          <w:rFonts w:ascii="Helvetica Light" w:hAnsi="Helvetica Light" w:cs="Helvetica Light"/>
+          <w:rFonts w:ascii="Times New Roman" w:hAnsi="Times New Roman" w:cs="Times New Roman"/>
         </w:rPr>
         <w:t>pemakaian</w:t>
       </w:r>
       <w:proofErr w:type="spellEnd"/>
       <w:r>
         <w:rPr>
-          <w:rFonts w:ascii="Helvetica Light" w:hAnsi="Helvetica Light" w:cs="Helvetica Light"/>
+          <w:rFonts w:ascii="Times New Roman" w:hAnsi="Times New Roman" w:cs="Times New Roman"/>
         </w:rPr>
         <w:t xml:space="preserve">, </w:t>
       </w:r>
       <w:proofErr w:type="spellStart"/>
       <w:r>
         <w:rPr>
-          <w:rFonts w:ascii="Helvetica Light" w:hAnsi="Helvetica Light" w:cs="Helvetica Light"/>
+          <w:rFonts w:ascii="Times New Roman" w:hAnsi="Times New Roman" w:cs="Times New Roman"/>
         </w:rPr>
         <w:t>lokasi</w:t>
       </w:r>
       <w:proofErr w:type="spellEnd"/>
       <w:r>
         <w:rPr>
-          <w:rFonts w:ascii="Helvetica Light" w:hAnsi="Helvetica Light" w:cs="Helvetica Light"/>
+          <w:rFonts w:ascii="Times New Roman" w:hAnsi="Times New Roman" w:cs="Times New Roman"/>
         </w:rPr>
         <w:t xml:space="preserve">, </w:t>
       </w:r>
       <w:proofErr w:type="spellStart"/>
       <w:r>
         <w:rPr>
-          <w:rFonts w:ascii="Helvetica Light" w:hAnsi="Helvetica Light" w:cs="Helvetica Light"/>
+          <w:rFonts w:ascii="Times New Roman" w:hAnsi="Times New Roman" w:cs="Times New Roman"/>
         </w:rPr>
         <w:t>pengguna</w:t>
       </w:r>
       <w:proofErr w:type="spellEnd"/>
       <w:r>
         <w:rPr>
-          <w:rFonts w:ascii="Helvetica Light" w:hAnsi="Helvetica Light" w:cs="Helvetica Light"/>
-        </w:rPr>
-        <w:t xml:space="preserve"> </w:t>
-      </w:r>
-      <w:proofErr w:type="spellStart"/>
-      <w:r>
-        <w:rPr>
-          <w:rFonts w:ascii="Helvetica Light" w:hAnsi="Helvetica Light" w:cs="Helvetica Light"/>
+          <w:rFonts w:ascii="Times New Roman" w:hAnsi="Times New Roman" w:cs="Times New Roman"/>
+        </w:rPr>
+        <w:t xml:space="preserve"> </w:t>
+      </w:r>
+      <w:proofErr w:type="spellStart"/>
+      <w:r>
+        <w:rPr>
+          <w:rFonts w:ascii="Times New Roman" w:hAnsi="Times New Roman" w:cs="Times New Roman"/>
         </w:rPr>
         <w:t>saat</w:t>
       </w:r>
       <w:proofErr w:type="spellEnd"/>
       <w:r>
         <w:rPr>
-          <w:rFonts w:ascii="Helvetica Light" w:hAnsi="Helvetica Light" w:cs="Helvetica Light"/>
-        </w:rPr>
-        <w:t xml:space="preserve"> </w:t>
-      </w:r>
-      <w:proofErr w:type="spellStart"/>
-      <w:r>
-        <w:rPr>
-          <w:rFonts w:ascii="Helvetica Light" w:hAnsi="Helvetica Light" w:cs="Helvetica Light"/>
+          <w:rFonts w:ascii="Times New Roman" w:hAnsi="Times New Roman" w:cs="Times New Roman"/>
+        </w:rPr>
+        <w:t xml:space="preserve"> </w:t>
+      </w:r>
+      <w:proofErr w:type="spellStart"/>
+      <w:r>
+        <w:rPr>
+          <w:rFonts w:ascii="Times New Roman" w:hAnsi="Times New Roman" w:cs="Times New Roman"/>
         </w:rPr>
         <w:t>ini</w:t>
       </w:r>
       <w:proofErr w:type="spellEnd"/>
       <w:r>
         <w:rPr>
-          <w:rFonts w:ascii="Helvetica Light" w:hAnsi="Helvetica Light" w:cs="Helvetica Light"/>
+          <w:rFonts w:ascii="Times New Roman" w:hAnsi="Times New Roman" w:cs="Times New Roman"/>
         </w:rPr>
         <w:t xml:space="preserve">, </w:t>
       </w:r>
       <w:proofErr w:type="spellStart"/>
       <w:r>
         <w:rPr>
-          <w:rFonts w:ascii="Helvetica Light" w:hAnsi="Helvetica Light" w:cs="Helvetica Light"/>
+          <w:rFonts w:ascii="Times New Roman" w:hAnsi="Times New Roman" w:cs="Times New Roman"/>
         </w:rPr>
         <w:t>foto</w:t>
       </w:r>
       <w:proofErr w:type="spellEnd"/>
       <w:r>
         <w:rPr>
-          <w:rFonts w:ascii="Helvetica Light" w:hAnsi="Helvetica Light" w:cs="Helvetica Light"/>
+          <w:rFonts w:ascii="Times New Roman" w:hAnsi="Times New Roman" w:cs="Times New Roman"/>
         </w:rPr>
         <w:t xml:space="preserve">, </w:t>
       </w:r>
       <w:proofErr w:type="spellStart"/>
       <w:r>
         <w:rPr>
-          <w:rFonts w:ascii="Helvetica Light" w:hAnsi="Helvetica Light" w:cs="Helvetica Light"/>
+          <w:rFonts w:ascii="Times New Roman" w:hAnsi="Times New Roman" w:cs="Times New Roman"/>
         </w:rPr>
         <w:t>garansi</w:t>
       </w:r>
       <w:proofErr w:type="spellEnd"/>
       <w:r>
         <w:rPr>
-          <w:rFonts w:ascii="Helvetica Light" w:hAnsi="Helvetica Light" w:cs="Helvetica Light"/>
+          <w:rFonts w:ascii="Times New Roman" w:hAnsi="Times New Roman" w:cs="Times New Roman"/>
         </w:rPr>
         <w:t xml:space="preserve">, </w:t>
       </w:r>
       <w:proofErr w:type="spellStart"/>
       <w:r>
         <w:rPr>
-          <w:rFonts w:ascii="Helvetica Light" w:hAnsi="Helvetica Light" w:cs="Helvetica Light"/>
+          <w:rFonts w:ascii="Times New Roman" w:hAnsi="Times New Roman" w:cs="Times New Roman"/>
         </w:rPr>
         <w:t>riwayat</w:t>
       </w:r>
       <w:proofErr w:type="spellEnd"/>
       <w:r>
         <w:rPr>
-          <w:rFonts w:ascii="Helvetica Light" w:hAnsi="Helvetica Light" w:cs="Helvetica Light"/>
-        </w:rPr>
-        <w:t xml:space="preserve"> </w:t>
-      </w:r>
-      <w:proofErr w:type="spellStart"/>
-      <w:r>
-        <w:rPr>
-          <w:rFonts w:ascii="Helvetica Light" w:hAnsi="Helvetica Light" w:cs="Helvetica Light"/>
+          <w:rFonts w:ascii="Times New Roman" w:hAnsi="Times New Roman" w:cs="Times New Roman"/>
+        </w:rPr>
+        <w:t xml:space="preserve"> </w:t>
+      </w:r>
+      <w:proofErr w:type="spellStart"/>
+      <w:r>
+        <w:rPr>
+          <w:rFonts w:ascii="Times New Roman" w:hAnsi="Times New Roman" w:cs="Times New Roman"/>
         </w:rPr>
         <w:t>peristiwa</w:t>
       </w:r>
       <w:proofErr w:type="spellEnd"/>
       <w:r>
         <w:rPr>
-          <w:rFonts w:ascii="Helvetica Light" w:hAnsi="Helvetica Light" w:cs="Helvetica Light"/>
+          <w:rFonts w:ascii="Times New Roman" w:hAnsi="Times New Roman" w:cs="Times New Roman"/>
         </w:rPr>
         <w:t xml:space="preserve">, </w:t>
       </w:r>
       <w:proofErr w:type="spellStart"/>
       <w:r>
         <w:rPr>
-          <w:rFonts w:ascii="Helvetica Light" w:hAnsi="Helvetica Light" w:cs="Helvetica Light"/>
+          <w:rFonts w:ascii="Times New Roman" w:hAnsi="Times New Roman" w:cs="Times New Roman"/>
         </w:rPr>
         <w:t>serta</w:t>
       </w:r>
       <w:proofErr w:type="spellEnd"/>
       <w:r>
         <w:rPr>
-          <w:rFonts w:ascii="Helvetica Light" w:hAnsi="Helvetica Light" w:cs="Helvetica Light"/>
+          <w:rFonts w:ascii="Times New Roman" w:hAnsi="Times New Roman" w:cs="Times New Roman"/>
         </w:rPr>
         <w:t xml:space="preserve"> QR code asset.</w:t>
       </w:r>
     </w:p>
     <w:p>
       <w:pPr>
+        <w:ind w:firstLine="360"/>
         <w:jc w:val="both"/>
-      </w:pPr>
-      <w:r>
-        <w:rPr>
-          <w:rFonts w:ascii="Helvetica Light" w:hAnsi="Helvetica Light" w:cs="Helvetica Light"/>
+        <w:rPr>
+          <w:rFonts w:ascii="Times New Roman" w:hAnsi="Times New Roman" w:cs="Times New Roman"/>
+        </w:rPr>
+      </w:pPr>
+      <w:r>
+        <w:rPr>
+          <w:rFonts w:ascii="Times New Roman" w:hAnsi="Times New Roman" w:cs="Times New Roman"/>
         </w:rPr>
         <w:t xml:space="preserve">Fitur </w:t>
       </w:r>
       <w:proofErr w:type="spellStart"/>
       <w:r>
         <w:rPr>
-          <w:rFonts w:ascii="Helvetica Light" w:hAnsi="Helvetica Light" w:cs="Helvetica Light"/>
+          <w:rFonts w:ascii="Times New Roman" w:hAnsi="Times New Roman" w:cs="Times New Roman"/>
         </w:rPr>
         <w:t>utama</w:t>
       </w:r>
       <w:proofErr w:type="spellEnd"/>
       <w:r>
         <w:rPr>
-          <w:rFonts w:ascii="Helvetica Light" w:hAnsi="Helvetica Light" w:cs="Helvetica Light"/>
+          <w:rFonts w:ascii="Times New Roman" w:hAnsi="Times New Roman" w:cs="Times New Roman"/>
         </w:rPr>
         <w:t xml:space="preserve"> yang </w:t>
       </w:r>
       <w:proofErr w:type="spellStart"/>
       <w:r>
         <w:rPr>
-          <w:rFonts w:ascii="Helvetica Light" w:hAnsi="Helvetica Light" w:cs="Helvetica Light"/>
+          <w:rFonts w:ascii="Times New Roman" w:hAnsi="Times New Roman" w:cs="Times New Roman"/>
         </w:rPr>
         <w:t>aktif</w:t>
       </w:r>
       <w:proofErr w:type="spellEnd"/>
       <w:r>
         <w:rPr>
-          <w:rFonts w:ascii="Helvetica Light" w:hAnsi="Helvetica Light" w:cs="Helvetica Light"/>
+          <w:rFonts w:ascii="Times New Roman" w:hAnsi="Times New Roman" w:cs="Times New Roman"/>
         </w:rPr>
         <w:t xml:space="preserve"> di website </w:t>
       </w:r>
       <w:proofErr w:type="spellStart"/>
       <w:r>
         <w:rPr>
-          <w:rFonts w:ascii="Helvetica Light" w:hAnsi="Helvetica Light" w:cs="Helvetica Light"/>
+          <w:rFonts w:ascii="Times New Roman" w:hAnsi="Times New Roman" w:cs="Times New Roman"/>
         </w:rPr>
         <w:t>saat</w:t>
       </w:r>
       <w:proofErr w:type="spellEnd"/>
       <w:r>
         <w:rPr>
-          <w:rFonts w:ascii="Helvetica Light" w:hAnsi="Helvetica Light" w:cs="Helvetica Light"/>
-        </w:rPr>
-        <w:t xml:space="preserve"> </w:t>
-      </w:r>
-      <w:proofErr w:type="spellStart"/>
-      <w:r>
-        <w:rPr>
-          <w:rFonts w:ascii="Helvetica Light" w:hAnsi="Helvetica Light" w:cs="Helvetica Light"/>
+          <w:rFonts w:ascii="Times New Roman" w:hAnsi="Times New Roman" w:cs="Times New Roman"/>
+        </w:rPr>
+        <w:t xml:space="preserve"> </w:t>
+      </w:r>
+      <w:proofErr w:type="spellStart"/>
+      <w:r>
+        <w:rPr>
+          <w:rFonts w:ascii="Times New Roman" w:hAnsi="Times New Roman" w:cs="Times New Roman"/>
         </w:rPr>
         <w:t>ini</w:t>
       </w:r>
       <w:proofErr w:type="spellEnd"/>
       <w:r>
         <w:rPr>
-          <w:rFonts w:ascii="Helvetica Light" w:hAnsi="Helvetica Light" w:cs="Helvetica Light"/>
+          <w:rFonts w:ascii="Times New Roman" w:hAnsi="Times New Roman" w:cs="Times New Roman"/>
         </w:rPr>
         <w:t>:</w:t>
       </w:r>
@@ -531,52 +567,55 @@
           <w:numId w:val="3"/>
         </w:numPr>
         <w:jc w:val="both"/>
-      </w:pPr>
-      <w:r>
-        <w:rPr>
-          <w:rFonts w:ascii="Helvetica Light" w:hAnsi="Helvetica Light" w:cs="Helvetica Light"/>
+        <w:rPr>
+          <w:rFonts w:ascii="Times New Roman" w:hAnsi="Times New Roman" w:cs="Times New Roman"/>
+        </w:rPr>
+      </w:pPr>
+      <w:r>
+        <w:rPr>
+          <w:rFonts w:ascii="Times New Roman" w:hAnsi="Times New Roman" w:cs="Times New Roman"/>
         </w:rPr>
         <w:t xml:space="preserve">Login internal </w:t>
       </w:r>
       <w:proofErr w:type="spellStart"/>
       <w:r>
         <w:rPr>
-          <w:rFonts w:ascii="Helvetica Light" w:hAnsi="Helvetica Light" w:cs="Helvetica Light"/>
+          <w:rFonts w:ascii="Times New Roman" w:hAnsi="Times New Roman" w:cs="Times New Roman"/>
         </w:rPr>
         <w:t>untuk</w:t>
       </w:r>
       <w:proofErr w:type="spellEnd"/>
       <w:r>
         <w:rPr>
-          <w:rFonts w:ascii="Helvetica Light" w:hAnsi="Helvetica Light" w:cs="Helvetica Light"/>
+          <w:rFonts w:ascii="Times New Roman" w:hAnsi="Times New Roman" w:cs="Times New Roman"/>
         </w:rPr>
         <w:t xml:space="preserve"> admin/</w:t>
       </w:r>
       <w:proofErr w:type="spellStart"/>
       <w:r>
         <w:rPr>
-          <w:rFonts w:ascii="Helvetica Light" w:hAnsi="Helvetica Light" w:cs="Helvetica Light"/>
+          <w:rFonts w:ascii="Times New Roman" w:hAnsi="Times New Roman" w:cs="Times New Roman"/>
         </w:rPr>
         <w:t>petugas</w:t>
       </w:r>
       <w:proofErr w:type="spellEnd"/>
       <w:r>
         <w:rPr>
-          <w:rFonts w:ascii="Helvetica Light" w:hAnsi="Helvetica Light" w:cs="Helvetica Light"/>
-        </w:rPr>
-        <w:t xml:space="preserve"> </w:t>
-      </w:r>
-      <w:proofErr w:type="spellStart"/>
-      <w:r>
-        <w:rPr>
-          <w:rFonts w:ascii="Helvetica Light" w:hAnsi="Helvetica Light" w:cs="Helvetica Light"/>
+          <w:rFonts w:ascii="Times New Roman" w:hAnsi="Times New Roman" w:cs="Times New Roman"/>
+        </w:rPr>
+        <w:t xml:space="preserve"> </w:t>
+      </w:r>
+      <w:proofErr w:type="spellStart"/>
+      <w:r>
+        <w:rPr>
+          <w:rFonts w:ascii="Times New Roman" w:hAnsi="Times New Roman" w:cs="Times New Roman"/>
         </w:rPr>
         <w:t>inventaris</w:t>
       </w:r>
       <w:proofErr w:type="spellEnd"/>
       <w:r>
         <w:rPr>
-          <w:rFonts w:ascii="Helvetica Light" w:hAnsi="Helvetica Light" w:cs="Helvetica Light"/>
+          <w:rFonts w:ascii="Times New Roman" w:hAnsi="Times New Roman" w:cs="Times New Roman"/>
         </w:rPr>
         <w:t>.</w:t>
       </w:r>
@@ -589,122 +628,125 @@
           <w:numId w:val="3"/>
         </w:numPr>
         <w:jc w:val="both"/>
-      </w:pPr>
-      <w:r>
-        <w:rPr>
-          <w:rFonts w:ascii="Helvetica Light" w:hAnsi="Helvetica Light" w:cs="Helvetica Light"/>
+        <w:rPr>
+          <w:rFonts w:ascii="Times New Roman" w:hAnsi="Times New Roman" w:cs="Times New Roman"/>
+        </w:rPr>
+      </w:pPr>
+      <w:r>
+        <w:rPr>
+          <w:rFonts w:ascii="Times New Roman" w:hAnsi="Times New Roman" w:cs="Times New Roman"/>
         </w:rPr>
         <w:t xml:space="preserve">Dashboard </w:t>
       </w:r>
       <w:proofErr w:type="spellStart"/>
       <w:r>
         <w:rPr>
-          <w:rFonts w:ascii="Helvetica Light" w:hAnsi="Helvetica Light" w:cs="Helvetica Light"/>
+          <w:rFonts w:ascii="Times New Roman" w:hAnsi="Times New Roman" w:cs="Times New Roman"/>
         </w:rPr>
         <w:t>ringkasan</w:t>
       </w:r>
       <w:proofErr w:type="spellEnd"/>
       <w:r>
         <w:rPr>
-          <w:rFonts w:ascii="Helvetica Light" w:hAnsi="Helvetica Light" w:cs="Helvetica Light"/>
-        </w:rPr>
-        <w:t xml:space="preserve"> </w:t>
-      </w:r>
-      <w:proofErr w:type="spellStart"/>
-      <w:r>
-        <w:rPr>
-          <w:rFonts w:ascii="Helvetica Light" w:hAnsi="Helvetica Light" w:cs="Helvetica Light"/>
+          <w:rFonts w:ascii="Times New Roman" w:hAnsi="Times New Roman" w:cs="Times New Roman"/>
+        </w:rPr>
+        <w:t xml:space="preserve"> </w:t>
+      </w:r>
+      <w:proofErr w:type="spellStart"/>
+      <w:r>
+        <w:rPr>
+          <w:rFonts w:ascii="Times New Roman" w:hAnsi="Times New Roman" w:cs="Times New Roman"/>
         </w:rPr>
         <w:t>jumlah</w:t>
       </w:r>
       <w:proofErr w:type="spellEnd"/>
       <w:r>
         <w:rPr>
-          <w:rFonts w:ascii="Helvetica Light" w:hAnsi="Helvetica Light" w:cs="Helvetica Light"/>
+          <w:rFonts w:ascii="Times New Roman" w:hAnsi="Times New Roman" w:cs="Times New Roman"/>
         </w:rPr>
         <w:t xml:space="preserve"> asset, </w:t>
       </w:r>
       <w:proofErr w:type="spellStart"/>
       <w:r>
         <w:rPr>
-          <w:rFonts w:ascii="Helvetica Light" w:hAnsi="Helvetica Light" w:cs="Helvetica Light"/>
+          <w:rFonts w:ascii="Times New Roman" w:hAnsi="Times New Roman" w:cs="Times New Roman"/>
         </w:rPr>
         <w:t>kategori</w:t>
       </w:r>
       <w:proofErr w:type="spellEnd"/>
       <w:r>
         <w:rPr>
-          <w:rFonts w:ascii="Helvetica Light" w:hAnsi="Helvetica Light" w:cs="Helvetica Light"/>
+          <w:rFonts w:ascii="Times New Roman" w:hAnsi="Times New Roman" w:cs="Times New Roman"/>
         </w:rPr>
         <w:t xml:space="preserve">, status asset, </w:t>
       </w:r>
       <w:proofErr w:type="spellStart"/>
       <w:r>
         <w:rPr>
-          <w:rFonts w:ascii="Helvetica Light" w:hAnsi="Helvetica Light" w:cs="Helvetica Light"/>
+          <w:rFonts w:ascii="Times New Roman" w:hAnsi="Times New Roman" w:cs="Times New Roman"/>
         </w:rPr>
         <w:t>nilai</w:t>
       </w:r>
       <w:proofErr w:type="spellEnd"/>
       <w:r>
         <w:rPr>
-          <w:rFonts w:ascii="Helvetica Light" w:hAnsi="Helvetica Light" w:cs="Helvetica Light"/>
+          <w:rFonts w:ascii="Times New Roman" w:hAnsi="Times New Roman" w:cs="Times New Roman"/>
         </w:rPr>
         <w:t xml:space="preserve"> asset, </w:t>
       </w:r>
       <w:proofErr w:type="spellStart"/>
       <w:r>
         <w:rPr>
-          <w:rFonts w:ascii="Helvetica Light" w:hAnsi="Helvetica Light" w:cs="Helvetica Light"/>
+          <w:rFonts w:ascii="Times New Roman" w:hAnsi="Times New Roman" w:cs="Times New Roman"/>
         </w:rPr>
         <w:t>aktivitas</w:t>
       </w:r>
       <w:proofErr w:type="spellEnd"/>
       <w:r>
         <w:rPr>
-          <w:rFonts w:ascii="Helvetica Light" w:hAnsi="Helvetica Light" w:cs="Helvetica Light"/>
-        </w:rPr>
-        <w:t xml:space="preserve"> </w:t>
-      </w:r>
-      <w:proofErr w:type="spellStart"/>
-      <w:r>
-        <w:rPr>
-          <w:rFonts w:ascii="Helvetica Light" w:hAnsi="Helvetica Light" w:cs="Helvetica Light"/>
+          <w:rFonts w:ascii="Times New Roman" w:hAnsi="Times New Roman" w:cs="Times New Roman"/>
+        </w:rPr>
+        <w:t xml:space="preserve"> </w:t>
+      </w:r>
+      <w:proofErr w:type="spellStart"/>
+      <w:r>
+        <w:rPr>
+          <w:rFonts w:ascii="Times New Roman" w:hAnsi="Times New Roman" w:cs="Times New Roman"/>
         </w:rPr>
         <w:t>terbaru</w:t>
       </w:r>
       <w:proofErr w:type="spellEnd"/>
       <w:r>
         <w:rPr>
-          <w:rFonts w:ascii="Helvetica Light" w:hAnsi="Helvetica Light" w:cs="Helvetica Light"/>
+          <w:rFonts w:ascii="Times New Roman" w:hAnsi="Times New Roman" w:cs="Times New Roman"/>
         </w:rPr>
         <w:t xml:space="preserve">, dan </w:t>
       </w:r>
       <w:proofErr w:type="spellStart"/>
       <w:r>
         <w:rPr>
-          <w:rFonts w:ascii="Helvetica Light" w:hAnsi="Helvetica Light" w:cs="Helvetica Light"/>
+          <w:rFonts w:ascii="Times New Roman" w:hAnsi="Times New Roman" w:cs="Times New Roman"/>
         </w:rPr>
         <w:t>pengingat</w:t>
       </w:r>
       <w:proofErr w:type="spellEnd"/>
       <w:r>
         <w:rPr>
-          <w:rFonts w:ascii="Helvetica Light" w:hAnsi="Helvetica Light" w:cs="Helvetica Light"/>
-        </w:rPr>
-        <w:t xml:space="preserve"> </w:t>
-      </w:r>
-      <w:proofErr w:type="spellStart"/>
-      <w:r>
-        <w:rPr>
-          <w:rFonts w:ascii="Helvetica Light" w:hAnsi="Helvetica Light" w:cs="Helvetica Light"/>
+          <w:rFonts w:ascii="Times New Roman" w:hAnsi="Times New Roman" w:cs="Times New Roman"/>
+        </w:rPr>
+        <w:t xml:space="preserve"> </w:t>
+      </w:r>
+      <w:proofErr w:type="spellStart"/>
+      <w:r>
+        <w:rPr>
+          <w:rFonts w:ascii="Times New Roman" w:hAnsi="Times New Roman" w:cs="Times New Roman"/>
         </w:rPr>
         <w:t>garansi</w:t>
       </w:r>
       <w:proofErr w:type="spellEnd"/>
       <w:r>
         <w:rPr>
-          <w:rFonts w:ascii="Helvetica Light" w:hAnsi="Helvetica Light" w:cs="Helvetica Light"/>
+          <w:rFonts w:ascii="Times New Roman" w:hAnsi="Times New Roman" w:cs="Times New Roman"/>
         </w:rPr>
         <w:t>.</w:t>
       </w:r>
@@ -717,80 +759,83 @@
           <w:numId w:val="3"/>
         </w:numPr>
         <w:jc w:val="both"/>
-      </w:pPr>
-      <w:r>
-        <w:rPr>
-          <w:rFonts w:ascii="Helvetica Light" w:hAnsi="Helvetica Light" w:cs="Helvetica Light"/>
+        <w:rPr>
+          <w:rFonts w:ascii="Times New Roman" w:hAnsi="Times New Roman" w:cs="Times New Roman"/>
+        </w:rPr>
+      </w:pPr>
+      <w:r>
+        <w:rPr>
+          <w:rFonts w:ascii="Times New Roman" w:hAnsi="Times New Roman" w:cs="Times New Roman"/>
         </w:rPr>
         <w:t xml:space="preserve">Master data </w:t>
       </w:r>
       <w:proofErr w:type="spellStart"/>
       <w:r>
         <w:rPr>
-          <w:rFonts w:ascii="Helvetica Light" w:hAnsi="Helvetica Light" w:cs="Helvetica Light"/>
+          <w:rFonts w:ascii="Times New Roman" w:hAnsi="Times New Roman" w:cs="Times New Roman"/>
         </w:rPr>
         <w:t>kategori</w:t>
       </w:r>
       <w:proofErr w:type="spellEnd"/>
       <w:r>
         <w:rPr>
-          <w:rFonts w:ascii="Helvetica Light" w:hAnsi="Helvetica Light" w:cs="Helvetica Light"/>
-        </w:rPr>
-        <w:t xml:space="preserve"> </w:t>
-      </w:r>
-      <w:proofErr w:type="spellStart"/>
-      <w:r>
-        <w:rPr>
-          <w:rFonts w:ascii="Helvetica Light" w:hAnsi="Helvetica Light" w:cs="Helvetica Light"/>
+          <w:rFonts w:ascii="Times New Roman" w:hAnsi="Times New Roman" w:cs="Times New Roman"/>
+        </w:rPr>
+        <w:t xml:space="preserve"> </w:t>
+      </w:r>
+      <w:proofErr w:type="spellStart"/>
+      <w:r>
+        <w:rPr>
+          <w:rFonts w:ascii="Times New Roman" w:hAnsi="Times New Roman" w:cs="Times New Roman"/>
         </w:rPr>
         <w:t>untuk</w:t>
       </w:r>
       <w:proofErr w:type="spellEnd"/>
       <w:r>
         <w:rPr>
-          <w:rFonts w:ascii="Helvetica Light" w:hAnsi="Helvetica Light" w:cs="Helvetica Light"/>
-        </w:rPr>
-        <w:t xml:space="preserve"> </w:t>
-      </w:r>
-      <w:proofErr w:type="spellStart"/>
-      <w:r>
-        <w:rPr>
-          <w:rFonts w:ascii="Helvetica Light" w:hAnsi="Helvetica Light" w:cs="Helvetica Light"/>
+          <w:rFonts w:ascii="Times New Roman" w:hAnsi="Times New Roman" w:cs="Times New Roman"/>
+        </w:rPr>
+        <w:t xml:space="preserve"> </w:t>
+      </w:r>
+      <w:proofErr w:type="spellStart"/>
+      <w:r>
+        <w:rPr>
+          <w:rFonts w:ascii="Times New Roman" w:hAnsi="Times New Roman" w:cs="Times New Roman"/>
         </w:rPr>
         <w:t>pengelompokan</w:t>
       </w:r>
       <w:proofErr w:type="spellEnd"/>
       <w:r>
         <w:rPr>
-          <w:rFonts w:ascii="Helvetica Light" w:hAnsi="Helvetica Light" w:cs="Helvetica Light"/>
+          <w:rFonts w:ascii="Times New Roman" w:hAnsi="Times New Roman" w:cs="Times New Roman"/>
         </w:rPr>
         <w:t xml:space="preserve"> asset dan </w:t>
       </w:r>
       <w:proofErr w:type="spellStart"/>
       <w:r>
         <w:rPr>
-          <w:rFonts w:ascii="Helvetica Light" w:hAnsi="Helvetica Light" w:cs="Helvetica Light"/>
+          <w:rFonts w:ascii="Times New Roman" w:hAnsi="Times New Roman" w:cs="Times New Roman"/>
         </w:rPr>
         <w:t>pembentukan</w:t>
       </w:r>
       <w:proofErr w:type="spellEnd"/>
       <w:r>
         <w:rPr>
-          <w:rFonts w:ascii="Helvetica Light" w:hAnsi="Helvetica Light" w:cs="Helvetica Light"/>
-        </w:rPr>
-        <w:t xml:space="preserve"> </w:t>
-      </w:r>
-      <w:proofErr w:type="spellStart"/>
-      <w:r>
-        <w:rPr>
-          <w:rFonts w:ascii="Helvetica Light" w:hAnsi="Helvetica Light" w:cs="Helvetica Light"/>
+          <w:rFonts w:ascii="Times New Roman" w:hAnsi="Times New Roman" w:cs="Times New Roman"/>
+        </w:rPr>
+        <w:t xml:space="preserve"> </w:t>
+      </w:r>
+      <w:proofErr w:type="spellStart"/>
+      <w:r>
+        <w:rPr>
+          <w:rFonts w:ascii="Times New Roman" w:hAnsi="Times New Roman" w:cs="Times New Roman"/>
         </w:rPr>
         <w:t>kode</w:t>
       </w:r>
       <w:proofErr w:type="spellEnd"/>
       <w:r>
         <w:rPr>
-          <w:rFonts w:ascii="Helvetica Light" w:hAnsi="Helvetica Light" w:cs="Helvetica Light"/>
+          <w:rFonts w:ascii="Times New Roman" w:hAnsi="Times New Roman" w:cs="Times New Roman"/>
         </w:rPr>
         <w:t xml:space="preserve"> asset.</w:t>
       </w:r>
@@ -803,74 +848,83 @@
           <w:numId w:val="3"/>
         </w:numPr>
         <w:jc w:val="both"/>
-      </w:pPr>
-      <w:proofErr w:type="spellStart"/>
-      <w:r>
-        <w:rPr>
-          <w:rFonts w:ascii="Helvetica Light" w:hAnsi="Helvetica Light" w:cs="Helvetica Light"/>
+        <w:rPr>
+          <w:rFonts w:ascii="Times New Roman" w:hAnsi="Times New Roman" w:cs="Times New Roman"/>
+        </w:rPr>
+      </w:pPr>
+      <w:proofErr w:type="spellStart"/>
+      <w:r>
+        <w:rPr>
+          <w:rFonts w:ascii="Times New Roman" w:hAnsi="Times New Roman" w:cs="Times New Roman"/>
         </w:rPr>
         <w:t>Pencatatan</w:t>
       </w:r>
       <w:proofErr w:type="spellEnd"/>
       <w:r>
         <w:rPr>
-          <w:rFonts w:ascii="Helvetica Light" w:hAnsi="Helvetica Light" w:cs="Helvetica Light"/>
+          <w:rFonts w:ascii="Times New Roman" w:hAnsi="Times New Roman" w:cs="Times New Roman"/>
         </w:rPr>
         <w:t xml:space="preserve"> asset </w:t>
       </w:r>
       <w:proofErr w:type="spellStart"/>
       <w:r>
         <w:rPr>
-          <w:rFonts w:ascii="Helvetica Light" w:hAnsi="Helvetica Light" w:cs="Helvetica Light"/>
+          <w:rFonts w:ascii="Times New Roman" w:hAnsi="Times New Roman" w:cs="Times New Roman"/>
         </w:rPr>
         <w:t>lengkap</w:t>
       </w:r>
       <w:proofErr w:type="spellEnd"/>
       <w:r>
         <w:rPr>
-          <w:rFonts w:ascii="Helvetica Light" w:hAnsi="Helvetica Light" w:cs="Helvetica Light"/>
-        </w:rPr>
-        <w:t xml:space="preserve"> </w:t>
-      </w:r>
-      <w:proofErr w:type="spellStart"/>
-      <w:r>
-        <w:rPr>
-          <w:rFonts w:ascii="Helvetica Light" w:hAnsi="Helvetica Light" w:cs="Helvetica Light"/>
+          <w:rFonts w:ascii="Times New Roman" w:hAnsi="Times New Roman" w:cs="Times New Roman"/>
+        </w:rPr>
+        <w:t xml:space="preserve"> </w:t>
+      </w:r>
+      <w:proofErr w:type="spellStart"/>
+      <w:r>
+        <w:rPr>
+          <w:rFonts w:ascii="Times New Roman" w:hAnsi="Times New Roman" w:cs="Times New Roman"/>
         </w:rPr>
         <w:t>beserta</w:t>
       </w:r>
       <w:proofErr w:type="spellEnd"/>
       <w:r>
         <w:rPr>
-          <w:rFonts w:ascii="Helvetica Light" w:hAnsi="Helvetica Light" w:cs="Helvetica Light"/>
+          <w:rFonts w:ascii="Times New Roman" w:hAnsi="Times New Roman" w:cs="Times New Roman"/>
         </w:rPr>
         <w:t xml:space="preserve"> detail </w:t>
       </w:r>
-      <w:proofErr w:type="spellStart"/>
-      <w:r>
-        <w:rPr>
-          <w:rFonts w:ascii="Helvetica Light" w:hAnsi="Helvetica Light" w:cs="Helvetica Light"/>
+      <w:r>
+        <w:rPr>
+          <w:rFonts w:ascii="Times New Roman" w:hAnsi="Times New Roman" w:cs="Times New Roman"/>
+        </w:rPr>
+        <w:t xml:space="preserve"> </w:t>
+      </w:r>
+      <w:proofErr w:type="spellStart"/>
+      <w:r>
+        <w:rPr>
+          <w:rFonts w:ascii="Times New Roman" w:hAnsi="Times New Roman" w:cs="Times New Roman"/>
         </w:rPr>
         <w:t>teknis</w:t>
       </w:r>
       <w:proofErr w:type="spellEnd"/>
       <w:r>
         <w:rPr>
-          <w:rFonts w:ascii="Helvetica Light" w:hAnsi="Helvetica Light" w:cs="Helvetica Light"/>
+          <w:rFonts w:ascii="Times New Roman" w:hAnsi="Times New Roman" w:cs="Times New Roman"/>
         </w:rPr>
         <w:t xml:space="preserve"> dan </w:t>
       </w:r>
       <w:proofErr w:type="spellStart"/>
       <w:r>
         <w:rPr>
-          <w:rFonts w:ascii="Helvetica Light" w:hAnsi="Helvetica Light" w:cs="Helvetica Light"/>
+          <w:rFonts w:ascii="Times New Roman" w:hAnsi="Times New Roman" w:cs="Times New Roman"/>
         </w:rPr>
         <w:t>operasional</w:t>
       </w:r>
       <w:proofErr w:type="spellEnd"/>
       <w:r>
         <w:rPr>
-          <w:rFonts w:ascii="Helvetica Light" w:hAnsi="Helvetica Light" w:cs="Helvetica Light"/>
+          <w:rFonts w:ascii="Times New Roman" w:hAnsi="Times New Roman" w:cs="Times New Roman"/>
         </w:rPr>
         <w:t>.</w:t>
       </w:r>
@@ -883,32 +937,35 @@
           <w:numId w:val="3"/>
         </w:numPr>
         <w:jc w:val="both"/>
-      </w:pPr>
-      <w:proofErr w:type="spellStart"/>
-      <w:r>
-        <w:rPr>
-          <w:rFonts w:ascii="Helvetica Light" w:hAnsi="Helvetica Light" w:cs="Helvetica Light"/>
+        <w:rPr>
+          <w:rFonts w:ascii="Times New Roman" w:hAnsi="Times New Roman" w:cs="Times New Roman"/>
+        </w:rPr>
+      </w:pPr>
+      <w:proofErr w:type="spellStart"/>
+      <w:r>
+        <w:rPr>
+          <w:rFonts w:ascii="Times New Roman" w:hAnsi="Times New Roman" w:cs="Times New Roman"/>
         </w:rPr>
         <w:t>Pencarian</w:t>
       </w:r>
       <w:proofErr w:type="spellEnd"/>
       <w:r>
         <w:rPr>
-          <w:rFonts w:ascii="Helvetica Light" w:hAnsi="Helvetica Light" w:cs="Helvetica Light"/>
+          <w:rFonts w:ascii="Times New Roman" w:hAnsi="Times New Roman" w:cs="Times New Roman"/>
         </w:rPr>
         <w:t xml:space="preserve">, filter, edit, dan </w:t>
       </w:r>
       <w:proofErr w:type="spellStart"/>
       <w:r>
         <w:rPr>
-          <w:rFonts w:ascii="Helvetica Light" w:hAnsi="Helvetica Light" w:cs="Helvetica Light"/>
+          <w:rFonts w:ascii="Times New Roman" w:hAnsi="Times New Roman" w:cs="Times New Roman"/>
         </w:rPr>
         <w:t>pemantauan</w:t>
       </w:r>
       <w:proofErr w:type="spellEnd"/>
       <w:r>
         <w:rPr>
-          <w:rFonts w:ascii="Helvetica Light" w:hAnsi="Helvetica Light" w:cs="Helvetica Light"/>
+          <w:rFonts w:ascii="Times New Roman" w:hAnsi="Times New Roman" w:cs="Times New Roman"/>
         </w:rPr>
         <w:t xml:space="preserve"> detail asset.</w:t>
       </w:r>
@@ -921,32 +978,35 @@
           <w:numId w:val="3"/>
         </w:numPr>
         <w:jc w:val="both"/>
-      </w:pPr>
-      <w:proofErr w:type="spellStart"/>
-      <w:r>
-        <w:rPr>
-          <w:rFonts w:ascii="Helvetica Light" w:hAnsi="Helvetica Light" w:cs="Helvetica Light"/>
+        <w:rPr>
+          <w:rFonts w:ascii="Times New Roman" w:hAnsi="Times New Roman" w:cs="Times New Roman"/>
+        </w:rPr>
+      </w:pPr>
+      <w:proofErr w:type="spellStart"/>
+      <w:r>
+        <w:rPr>
+          <w:rFonts w:ascii="Times New Roman" w:hAnsi="Times New Roman" w:cs="Times New Roman"/>
         </w:rPr>
         <w:t>Pencetakan</w:t>
       </w:r>
       <w:proofErr w:type="spellEnd"/>
       <w:r>
         <w:rPr>
-          <w:rFonts w:ascii="Helvetica Light" w:hAnsi="Helvetica Light" w:cs="Helvetica Light"/>
+          <w:rFonts w:ascii="Times New Roman" w:hAnsi="Times New Roman" w:cs="Times New Roman"/>
         </w:rPr>
         <w:t xml:space="preserve"> QR, </w:t>
       </w:r>
       <w:proofErr w:type="spellStart"/>
       <w:r>
         <w:rPr>
-          <w:rFonts w:ascii="Helvetica Light" w:hAnsi="Helvetica Light" w:cs="Helvetica Light"/>
+          <w:rFonts w:ascii="Times New Roman" w:hAnsi="Times New Roman" w:cs="Times New Roman"/>
         </w:rPr>
         <w:t>kode</w:t>
       </w:r>
       <w:proofErr w:type="spellEnd"/>
       <w:r>
         <w:rPr>
-          <w:rFonts w:ascii="Helvetica Light" w:hAnsi="Helvetica Light" w:cs="Helvetica Light"/>
+          <w:rFonts w:ascii="Times New Roman" w:hAnsi="Times New Roman" w:cs="Times New Roman"/>
         </w:rPr>
         <w:t xml:space="preserve"> asset, dan label asset.</w:t>
       </w:r>
@@ -959,108 +1019,111 @@
           <w:numId w:val="3"/>
         </w:numPr>
         <w:jc w:val="both"/>
-      </w:pPr>
-      <w:r>
-        <w:rPr>
-          <w:rFonts w:ascii="Helvetica Light" w:hAnsi="Helvetica Light" w:cs="Helvetica Light"/>
+        <w:rPr>
+          <w:rFonts w:ascii="Times New Roman" w:hAnsi="Times New Roman" w:cs="Times New Roman"/>
+        </w:rPr>
+      </w:pPr>
+      <w:r>
+        <w:rPr>
+          <w:rFonts w:ascii="Times New Roman" w:hAnsi="Times New Roman" w:cs="Times New Roman"/>
         </w:rPr>
         <w:t xml:space="preserve">Riwayat asset </w:t>
       </w:r>
       <w:proofErr w:type="spellStart"/>
       <w:r>
         <w:rPr>
-          <w:rFonts w:ascii="Helvetica Light" w:hAnsi="Helvetica Light" w:cs="Helvetica Light"/>
+          <w:rFonts w:ascii="Times New Roman" w:hAnsi="Times New Roman" w:cs="Times New Roman"/>
         </w:rPr>
         <w:t>untuk</w:t>
       </w:r>
       <w:proofErr w:type="spellEnd"/>
       <w:r>
         <w:rPr>
-          <w:rFonts w:ascii="Helvetica Light" w:hAnsi="Helvetica Light" w:cs="Helvetica Light"/>
+          <w:rFonts w:ascii="Times New Roman" w:hAnsi="Times New Roman" w:cs="Times New Roman"/>
         </w:rPr>
         <w:t xml:space="preserve"> maintenance, </w:t>
       </w:r>
       <w:proofErr w:type="spellStart"/>
       <w:r>
         <w:rPr>
-          <w:rFonts w:ascii="Helvetica Light" w:hAnsi="Helvetica Light" w:cs="Helvetica Light"/>
+          <w:rFonts w:ascii="Times New Roman" w:hAnsi="Times New Roman" w:cs="Times New Roman"/>
         </w:rPr>
         <w:t>servis</w:t>
       </w:r>
       <w:proofErr w:type="spellEnd"/>
       <w:r>
         <w:rPr>
-          <w:rFonts w:ascii="Helvetica Light" w:hAnsi="Helvetica Light" w:cs="Helvetica Light"/>
+          <w:rFonts w:ascii="Times New Roman" w:hAnsi="Times New Roman" w:cs="Times New Roman"/>
         </w:rPr>
         <w:t xml:space="preserve">, </w:t>
       </w:r>
       <w:proofErr w:type="spellStart"/>
       <w:r>
         <w:rPr>
-          <w:rFonts w:ascii="Helvetica Light" w:hAnsi="Helvetica Light" w:cs="Helvetica Light"/>
+          <w:rFonts w:ascii="Times New Roman" w:hAnsi="Times New Roman" w:cs="Times New Roman"/>
         </w:rPr>
         <w:t>relokasi</w:t>
       </w:r>
       <w:proofErr w:type="spellEnd"/>
       <w:r>
         <w:rPr>
-          <w:rFonts w:ascii="Helvetica Light" w:hAnsi="Helvetica Light" w:cs="Helvetica Light"/>
+          <w:rFonts w:ascii="Times New Roman" w:hAnsi="Times New Roman" w:cs="Times New Roman"/>
         </w:rPr>
         <w:t xml:space="preserve">, </w:t>
       </w:r>
       <w:proofErr w:type="spellStart"/>
       <w:r>
         <w:rPr>
-          <w:rFonts w:ascii="Helvetica Light" w:hAnsi="Helvetica Light" w:cs="Helvetica Light"/>
+          <w:rFonts w:ascii="Times New Roman" w:hAnsi="Times New Roman" w:cs="Times New Roman"/>
         </w:rPr>
         <w:t>penyerahan</w:t>
       </w:r>
       <w:proofErr w:type="spellEnd"/>
       <w:r>
         <w:rPr>
-          <w:rFonts w:ascii="Helvetica Light" w:hAnsi="Helvetica Light" w:cs="Helvetica Light"/>
+          <w:rFonts w:ascii="Times New Roman" w:hAnsi="Times New Roman" w:cs="Times New Roman"/>
         </w:rPr>
         <w:t xml:space="preserve">, </w:t>
       </w:r>
       <w:proofErr w:type="spellStart"/>
       <w:r>
         <w:rPr>
-          <w:rFonts w:ascii="Helvetica Light" w:hAnsi="Helvetica Light" w:cs="Helvetica Light"/>
+          <w:rFonts w:ascii="Times New Roman" w:hAnsi="Times New Roman" w:cs="Times New Roman"/>
         </w:rPr>
         <w:t>insiden</w:t>
       </w:r>
       <w:proofErr w:type="spellEnd"/>
       <w:r>
         <w:rPr>
-          <w:rFonts w:ascii="Helvetica Light" w:hAnsi="Helvetica Light" w:cs="Helvetica Light"/>
+          <w:rFonts w:ascii="Times New Roman" w:hAnsi="Times New Roman" w:cs="Times New Roman"/>
         </w:rPr>
         <w:t xml:space="preserve">, </w:t>
       </w:r>
       <w:proofErr w:type="spellStart"/>
       <w:r>
         <w:rPr>
-          <w:rFonts w:ascii="Helvetica Light" w:hAnsi="Helvetica Light" w:cs="Helvetica Light"/>
+          <w:rFonts w:ascii="Times New Roman" w:hAnsi="Times New Roman" w:cs="Times New Roman"/>
         </w:rPr>
         <w:t>atau</w:t>
       </w:r>
       <w:proofErr w:type="spellEnd"/>
       <w:r>
         <w:rPr>
-          <w:rFonts w:ascii="Helvetica Light" w:hAnsi="Helvetica Light" w:cs="Helvetica Light"/>
-        </w:rPr>
-        <w:t xml:space="preserve"> </w:t>
-      </w:r>
-      <w:proofErr w:type="spellStart"/>
-      <w:r>
-        <w:rPr>
-          <w:rFonts w:ascii="Helvetica Light" w:hAnsi="Helvetica Light" w:cs="Helvetica Light"/>
+          <w:rFonts w:ascii="Times New Roman" w:hAnsi="Times New Roman" w:cs="Times New Roman"/>
+        </w:rPr>
+        <w:t xml:space="preserve"> </w:t>
+      </w:r>
+      <w:proofErr w:type="spellStart"/>
+      <w:r>
+        <w:rPr>
+          <w:rFonts w:ascii="Times New Roman" w:hAnsi="Times New Roman" w:cs="Times New Roman"/>
         </w:rPr>
         <w:t>catatan</w:t>
       </w:r>
       <w:proofErr w:type="spellEnd"/>
       <w:r>
         <w:rPr>
-          <w:rFonts w:ascii="Helvetica Light" w:hAnsi="Helvetica Light" w:cs="Helvetica Light"/>
+          <w:rFonts w:ascii="Times New Roman" w:hAnsi="Times New Roman" w:cs="Times New Roman"/>
         </w:rPr>
         <w:t>.</w:t>
       </w:r>
@@ -1073,52 +1136,55 @@
           <w:numId w:val="3"/>
         </w:numPr>
         <w:jc w:val="both"/>
-      </w:pPr>
-      <w:r>
-        <w:rPr>
-          <w:rFonts w:ascii="Helvetica Light" w:hAnsi="Helvetica Light" w:cs="Helvetica Light"/>
+        <w:rPr>
+          <w:rFonts w:ascii="Times New Roman" w:hAnsi="Times New Roman" w:cs="Times New Roman"/>
+        </w:rPr>
+      </w:pPr>
+      <w:r>
+        <w:rPr>
+          <w:rFonts w:ascii="Times New Roman" w:hAnsi="Times New Roman" w:cs="Times New Roman"/>
         </w:rPr>
         <w:t xml:space="preserve">Export asset </w:t>
       </w:r>
       <w:proofErr w:type="spellStart"/>
       <w:r>
         <w:rPr>
-          <w:rFonts w:ascii="Helvetica Light" w:hAnsi="Helvetica Light" w:cs="Helvetica Light"/>
+          <w:rFonts w:ascii="Times New Roman" w:hAnsi="Times New Roman" w:cs="Times New Roman"/>
         </w:rPr>
         <w:t>terpilih</w:t>
       </w:r>
       <w:proofErr w:type="spellEnd"/>
       <w:r>
         <w:rPr>
-          <w:rFonts w:ascii="Helvetica Light" w:hAnsi="Helvetica Light" w:cs="Helvetica Light"/>
-        </w:rPr>
-        <w:t xml:space="preserve"> </w:t>
-      </w:r>
-      <w:proofErr w:type="spellStart"/>
-      <w:r>
-        <w:rPr>
-          <w:rFonts w:ascii="Helvetica Light" w:hAnsi="Helvetica Light" w:cs="Helvetica Light"/>
+          <w:rFonts w:ascii="Times New Roman" w:hAnsi="Times New Roman" w:cs="Times New Roman"/>
+        </w:rPr>
+        <w:t xml:space="preserve"> </w:t>
+      </w:r>
+      <w:proofErr w:type="spellStart"/>
+      <w:r>
+        <w:rPr>
+          <w:rFonts w:ascii="Times New Roman" w:hAnsi="Times New Roman" w:cs="Times New Roman"/>
         </w:rPr>
         <w:t>ke</w:t>
       </w:r>
       <w:proofErr w:type="spellEnd"/>
       <w:r>
         <w:rPr>
-          <w:rFonts w:ascii="Helvetica Light" w:hAnsi="Helvetica Light" w:cs="Helvetica Light"/>
+          <w:rFonts w:ascii="Times New Roman" w:hAnsi="Times New Roman" w:cs="Times New Roman"/>
         </w:rPr>
         <w:t xml:space="preserve"> Excel </w:t>
       </w:r>
       <w:proofErr w:type="spellStart"/>
       <w:r>
         <w:rPr>
-          <w:rFonts w:ascii="Helvetica Light" w:hAnsi="Helvetica Light" w:cs="Helvetica Light"/>
+          <w:rFonts w:ascii="Times New Roman" w:hAnsi="Times New Roman" w:cs="Times New Roman"/>
         </w:rPr>
         <w:t>atau</w:t>
       </w:r>
       <w:proofErr w:type="spellEnd"/>
       <w:r>
         <w:rPr>
-          <w:rFonts w:ascii="Helvetica Light" w:hAnsi="Helvetica Light" w:cs="Helvetica Light"/>
+          <w:rFonts w:ascii="Times New Roman" w:hAnsi="Times New Roman" w:cs="Times New Roman"/>
         </w:rPr>
         <w:t xml:space="preserve"> PDF.</w:t>
       </w:r>
@@ -1131,59 +1197,66 @@
           <w:numId w:val="3"/>
         </w:numPr>
         <w:jc w:val="both"/>
-      </w:pPr>
-      <w:r>
-        <w:rPr>
-          <w:rFonts w:ascii="Helvetica Light" w:hAnsi="Helvetica Light" w:cs="Helvetica Light"/>
+        <w:rPr>
+          <w:rFonts w:ascii="Times New Roman" w:hAnsi="Times New Roman" w:cs="Times New Roman"/>
+        </w:rPr>
+      </w:pPr>
+      <w:r>
+        <w:rPr>
+          <w:rFonts w:ascii="Times New Roman" w:hAnsi="Times New Roman" w:cs="Times New Roman"/>
         </w:rPr>
         <w:t xml:space="preserve">Halaman </w:t>
       </w:r>
       <w:proofErr w:type="spellStart"/>
       <w:r>
         <w:rPr>
-          <w:rFonts w:ascii="Helvetica Light" w:hAnsi="Helvetica Light" w:cs="Helvetica Light"/>
+          <w:rFonts w:ascii="Times New Roman" w:hAnsi="Times New Roman" w:cs="Times New Roman"/>
         </w:rPr>
         <w:t>publik</w:t>
       </w:r>
       <w:proofErr w:type="spellEnd"/>
       <w:r>
         <w:rPr>
-          <w:rFonts w:ascii="Helvetica Light" w:hAnsi="Helvetica Light" w:cs="Helvetica Light"/>
-        </w:rPr>
-        <w:t xml:space="preserve"> </w:t>
-      </w:r>
-      <w:proofErr w:type="spellStart"/>
-      <w:r>
-        <w:rPr>
-          <w:rFonts w:ascii="Helvetica Light" w:hAnsi="Helvetica Light" w:cs="Helvetica Light"/>
+          <w:rFonts w:ascii="Times New Roman" w:hAnsi="Times New Roman" w:cs="Times New Roman"/>
+        </w:rPr>
+        <w:t xml:space="preserve"> </w:t>
+      </w:r>
+      <w:proofErr w:type="spellStart"/>
+      <w:r>
+        <w:rPr>
+          <w:rFonts w:ascii="Times New Roman" w:hAnsi="Times New Roman" w:cs="Times New Roman"/>
         </w:rPr>
         <w:t>hasil</w:t>
       </w:r>
       <w:proofErr w:type="spellEnd"/>
       <w:r>
         <w:rPr>
-          <w:rFonts w:ascii="Helvetica Light" w:hAnsi="Helvetica Light" w:cs="Helvetica Light"/>
+          <w:rFonts w:ascii="Times New Roman" w:hAnsi="Times New Roman" w:cs="Times New Roman"/>
         </w:rPr>
         <w:t xml:space="preserve"> scan QR </w:t>
       </w:r>
       <w:proofErr w:type="spellStart"/>
       <w:r>
         <w:rPr>
-          <w:rFonts w:ascii="Helvetica Light" w:hAnsi="Helvetica Light" w:cs="Helvetica Light"/>
+          <w:rFonts w:ascii="Times New Roman" w:hAnsi="Times New Roman" w:cs="Times New Roman"/>
         </w:rPr>
         <w:t>tanpa</w:t>
       </w:r>
       <w:proofErr w:type="spellEnd"/>
       <w:r>
         <w:rPr>
-          <w:rFonts w:ascii="Helvetica Light" w:hAnsi="Helvetica Light" w:cs="Helvetica Light"/>
+          <w:rFonts w:ascii="Times New Roman" w:hAnsi="Times New Roman" w:cs="Times New Roman"/>
         </w:rPr>
         <w:t xml:space="preserve"> login.</w:t>
       </w:r>
     </w:p>
     <w:p>
       <w:pPr>
+        <w:pStyle w:val="ListParagraph"/>
         <w:jc w:val="both"/>
+        <w:rPr>
+          <w:rFonts w:ascii="Times New Roman" w:hAnsi="Times New Roman" w:cs="Times New Roman"/>
+        </w:rPr>
       </w:pPr>
     </w:p>
     <w:p>
@@ -1194,97 +1267,116 @@
           <w:numId w:val="1"/>
         </w:numPr>
         <w:rPr>
+          <w:rFonts w:ascii="Times New Roman" w:hAnsi="Times New Roman" w:cs="Times New Roman"/>
           <w:b/>
           <w:bCs/>
-        </w:rPr>
-      </w:pPr>
-      <w:proofErr w:type="spellStart"/>
-      <w:r>
-        <w:rPr>
-          <w:rFonts w:ascii="Helvetica Light" w:hAnsi="Helvetica Light" w:cs="Helvetica Light"/>
+          <w:sz w:val="26"/>
+          <w:szCs w:val="26"/>
+        </w:rPr>
+      </w:pPr>
+      <w:proofErr w:type="spellStart"/>
+      <w:r>
+        <w:rPr>
+          <w:rFonts w:ascii="Times New Roman" w:hAnsi="Times New Roman" w:cs="Times New Roman"/>
           <w:b/>
           <w:bCs/>
+          <w:sz w:val="26"/>
+          <w:szCs w:val="26"/>
         </w:rPr>
         <w:t>Rekomendasi</w:t>
       </w:r>
       <w:proofErr w:type="spellEnd"/>
       <w:r>
         <w:rPr>
-          <w:rFonts w:ascii="Helvetica Light" w:hAnsi="Helvetica Light" w:cs="Helvetica Light"/>
+          <w:rFonts w:ascii="Times New Roman" w:hAnsi="Times New Roman" w:cs="Times New Roman"/>
           <w:b/>
           <w:bCs/>
+          <w:sz w:val="26"/>
+          <w:szCs w:val="26"/>
         </w:rPr>
         <w:t xml:space="preserve"> Cara </w:t>
       </w:r>
       <w:proofErr w:type="spellStart"/>
       <w:r>
         <w:rPr>
-          <w:rFonts w:ascii="Helvetica Light" w:hAnsi="Helvetica Light" w:cs="Helvetica Light"/>
+          <w:rFonts w:ascii="Times New Roman" w:hAnsi="Times New Roman" w:cs="Times New Roman"/>
           <w:b/>
           <w:bCs/>
+          <w:sz w:val="26"/>
+          <w:szCs w:val="26"/>
         </w:rPr>
         <w:t>Pakai</w:t>
       </w:r>
       <w:proofErr w:type="spellEnd"/>
       <w:r>
         <w:rPr>
-          <w:rFonts w:ascii="Helvetica Light" w:hAnsi="Helvetica Light" w:cs="Helvetica Light"/>
+          <w:rFonts w:ascii="Times New Roman" w:hAnsi="Times New Roman" w:cs="Times New Roman"/>
           <w:b/>
           <w:bCs/>
-        </w:rPr>
-        <w:t xml:space="preserve"> </w:t>
-      </w:r>
-      <w:proofErr w:type="spellStart"/>
-      <w:r>
-        <w:rPr>
-          <w:rFonts w:ascii="Helvetica Light" w:hAnsi="Helvetica Light" w:cs="Helvetica Light"/>
+          <w:sz w:val="26"/>
+          <w:szCs w:val="26"/>
+        </w:rPr>
+        <w:t xml:space="preserve"> </w:t>
+      </w:r>
+      <w:proofErr w:type="spellStart"/>
+      <w:r>
+        <w:rPr>
+          <w:rFonts w:ascii="Times New Roman" w:hAnsi="Times New Roman" w:cs="Times New Roman"/>
           <w:b/>
           <w:bCs/>
+          <w:sz w:val="26"/>
+          <w:szCs w:val="26"/>
         </w:rPr>
         <w:t>Harian</w:t>
       </w:r>
       <w:proofErr w:type="spellEnd"/>
     </w:p>
     <w:p>
-      <w:proofErr w:type="spellStart"/>
-      <w:r>
-        <w:rPr>
-          <w:rFonts w:ascii="Helvetica Light" w:hAnsi="Helvetica Light" w:cs="Helvetica Light"/>
+      <w:pPr>
+        <w:ind w:firstLine="360"/>
+        <w:rPr>
+          <w:rFonts w:ascii="Times New Roman" w:hAnsi="Times New Roman" w:cs="Times New Roman"/>
+        </w:rPr>
+      </w:pPr>
+      <w:proofErr w:type="spellStart"/>
+      <w:r>
+        <w:rPr>
+          <w:rFonts w:ascii="Times New Roman" w:hAnsi="Times New Roman" w:cs="Times New Roman"/>
         </w:rPr>
         <w:t>Urutan</w:t>
       </w:r>
       <w:proofErr w:type="spellEnd"/>
       <w:r>
         <w:rPr>
-          <w:rFonts w:ascii="Helvetica Light" w:hAnsi="Helvetica Light" w:cs="Helvetica Light"/>
-        </w:rPr>
-        <w:t xml:space="preserve"> </w:t>
-      </w:r>
-      <w:proofErr w:type="spellStart"/>
-      <w:r>
-        <w:rPr>
-          <w:rFonts w:ascii="Helvetica Light" w:hAnsi="Helvetica Light" w:cs="Helvetica Light"/>
+          <w:rFonts w:ascii="Times New Roman" w:hAnsi="Times New Roman" w:cs="Times New Roman"/>
+        </w:rPr>
+        <w:t xml:space="preserve"> </w:t>
+      </w:r>
+      <w:proofErr w:type="spellStart"/>
+      <w:r>
+        <w:rPr>
+          <w:rFonts w:ascii="Times New Roman" w:hAnsi="Times New Roman" w:cs="Times New Roman"/>
         </w:rPr>
         <w:t>pemakaian</w:t>
       </w:r>
       <w:proofErr w:type="spellEnd"/>
       <w:r>
         <w:rPr>
-          <w:rFonts w:ascii="Helvetica Light" w:hAnsi="Helvetica Light" w:cs="Helvetica Light"/>
+          <w:rFonts w:ascii="Times New Roman" w:hAnsi="Times New Roman" w:cs="Times New Roman"/>
         </w:rPr>
         <w:t xml:space="preserve"> yang </w:t>
       </w:r>
       <w:proofErr w:type="spellStart"/>
       <w:r>
         <w:rPr>
-          <w:rFonts w:ascii="Helvetica Light" w:hAnsi="Helvetica Light" w:cs="Helvetica Light"/>
+          <w:rFonts w:ascii="Times New Roman" w:hAnsi="Times New Roman" w:cs="Times New Roman"/>
         </w:rPr>
         <w:t>disarankan</w:t>
       </w:r>
       <w:proofErr w:type="spellEnd"/>
       <w:r>
         <w:rPr>
-          <w:rFonts w:ascii="Helvetica Light" w:hAnsi="Helvetica Light" w:cs="Helvetica Light"/>
+          <w:rFonts w:ascii="Times New Roman" w:hAnsi="Times New Roman" w:cs="Times New Roman"/>
         </w:rPr>
         <w:t>:</w:t>
       </w:r>
@@ -1296,10 +1388,13 @@
           <w:ilvl w:val="0"/>
           <w:numId w:val="2"/>
         </w:numPr>
-      </w:pPr>
-      <w:r>
-        <w:rPr>
-          <w:rFonts w:ascii="Helvetica Light" w:hAnsi="Helvetica Light" w:cs="Helvetica Light"/>
+        <w:rPr>
+          <w:rFonts w:ascii="Times New Roman" w:hAnsi="Times New Roman" w:cs="Times New Roman"/>
+        </w:rPr>
+      </w:pPr>
+      <w:r>
+        <w:rPr>
+          <w:rFonts w:ascii="Times New Roman" w:hAnsi="Times New Roman" w:cs="Times New Roman"/>
         </w:rPr>
         <w:t>Login.</w:t>
       </w:r>
@@ -1311,16 +1406,21 @@
           <w:ilvl w:val="0"/>
           <w:numId w:val="2"/>
         </w:numPr>
-      </w:pPr>
-      <w:r>
-        <w:rPr>
-          <w:rFonts w:ascii="Helvetica Light" w:hAnsi="Helvetica Light" w:cs="Helvetica Light"/>
+        <w:rPr>
+          <w:rFonts w:ascii="Times New Roman" w:hAnsi="Times New Roman" w:cs="Times New Roman"/>
+        </w:rPr>
+      </w:pPr>
+      <w:r>
+        <w:rPr>
+          <w:rFonts w:ascii="Times New Roman" w:hAnsi="Times New Roman" w:cs="Times New Roman"/>
         </w:rPr>
         <w:t xml:space="preserve">Cek </w:t>
       </w:r>
       <w:r>
         <w:rPr>
-          <w:rFonts w:ascii="Helvetica Light" w:hAnsi="Helvetica Light" w:cs="Helvetica Light"/>
+          <w:rFonts w:ascii="Times New Roman" w:hAnsi="Times New Roman" w:cs="Times New Roman"/>
+          <w:b/>
+          <w:bCs/>
           <w:i/>
           <w:iCs/>
         </w:rPr>
@@ -1328,7 +1428,7 @@
       </w:r>
       <w:r>
         <w:rPr>
-          <w:rFonts w:ascii="Helvetica Light" w:hAnsi="Helvetica Light" w:cs="Helvetica Light"/>
+          <w:rFonts w:ascii="Times New Roman" w:hAnsi="Times New Roman" w:cs="Times New Roman"/>
         </w:rPr>
         <w:t>.</w:t>
       </w:r>
@@ -1340,46 +1440,49 @@
           <w:ilvl w:val="0"/>
           <w:numId w:val="2"/>
         </w:numPr>
-      </w:pPr>
-      <w:proofErr w:type="spellStart"/>
-      <w:r>
-        <w:rPr>
-          <w:rFonts w:ascii="Helvetica Light" w:hAnsi="Helvetica Light" w:cs="Helvetica Light"/>
+        <w:rPr>
+          <w:rFonts w:ascii="Times New Roman" w:hAnsi="Times New Roman" w:cs="Times New Roman"/>
+        </w:rPr>
+      </w:pPr>
+      <w:proofErr w:type="spellStart"/>
+      <w:r>
+        <w:rPr>
+          <w:rFonts w:ascii="Times New Roman" w:hAnsi="Times New Roman" w:cs="Times New Roman"/>
         </w:rPr>
         <w:t>Pastikan</w:t>
       </w:r>
       <w:proofErr w:type="spellEnd"/>
       <w:r>
         <w:rPr>
-          <w:rFonts w:ascii="Helvetica Light" w:hAnsi="Helvetica Light" w:cs="Helvetica Light"/>
+          <w:rFonts w:ascii="Times New Roman" w:hAnsi="Times New Roman" w:cs="Times New Roman"/>
         </w:rPr>
         <w:t xml:space="preserve"> Categories </w:t>
       </w:r>
       <w:proofErr w:type="spellStart"/>
       <w:r>
         <w:rPr>
-          <w:rFonts w:ascii="Helvetica Light" w:hAnsi="Helvetica Light" w:cs="Helvetica Light"/>
+          <w:rFonts w:ascii="Times New Roman" w:hAnsi="Times New Roman" w:cs="Times New Roman"/>
         </w:rPr>
         <w:t>sudah</w:t>
       </w:r>
       <w:proofErr w:type="spellEnd"/>
       <w:r>
         <w:rPr>
-          <w:rFonts w:ascii="Helvetica Light" w:hAnsi="Helvetica Light" w:cs="Helvetica Light"/>
-        </w:rPr>
-        <w:t xml:space="preserve"> </w:t>
-      </w:r>
-      <w:proofErr w:type="spellStart"/>
-      <w:r>
-        <w:rPr>
-          <w:rFonts w:ascii="Helvetica Light" w:hAnsi="Helvetica Light" w:cs="Helvetica Light"/>
+          <w:rFonts w:ascii="Times New Roman" w:hAnsi="Times New Roman" w:cs="Times New Roman"/>
+        </w:rPr>
+        <w:t xml:space="preserve"> </w:t>
+      </w:r>
+      <w:proofErr w:type="spellStart"/>
+      <w:r>
+        <w:rPr>
+          <w:rFonts w:ascii="Times New Roman" w:hAnsi="Times New Roman" w:cs="Times New Roman"/>
         </w:rPr>
         <w:t>benar</w:t>
       </w:r>
       <w:proofErr w:type="spellEnd"/>
       <w:r>
         <w:rPr>
-          <w:rFonts w:ascii="Helvetica Light" w:hAnsi="Helvetica Light" w:cs="Helvetica Light"/>
+          <w:rFonts w:ascii="Times New Roman" w:hAnsi="Times New Roman" w:cs="Times New Roman"/>
         </w:rPr>
         <w:t>.</w:t>
       </w:r>
@@ -1391,34 +1494,53 @@
           <w:ilvl w:val="0"/>
           <w:numId w:val="2"/>
         </w:numPr>
-      </w:pPr>
-      <w:proofErr w:type="spellStart"/>
-      <w:r>
-        <w:rPr>
-          <w:rFonts w:ascii="Helvetica Light" w:hAnsi="Helvetica Light" w:cs="Helvetica Light"/>
+        <w:rPr>
+          <w:rFonts w:ascii="Times New Roman" w:hAnsi="Times New Roman" w:cs="Times New Roman"/>
+        </w:rPr>
+      </w:pPr>
+      <w:proofErr w:type="spellStart"/>
+      <w:r>
+        <w:rPr>
+          <w:rFonts w:ascii="Times New Roman" w:hAnsi="Times New Roman" w:cs="Times New Roman"/>
         </w:rPr>
         <w:t>Tambah</w:t>
       </w:r>
       <w:proofErr w:type="spellEnd"/>
       <w:r>
         <w:rPr>
-          <w:rFonts w:ascii="Helvetica Light" w:hAnsi="Helvetica Light" w:cs="Helvetica Light"/>
-        </w:rPr>
-        <w:t xml:space="preserve"> </w:t>
-      </w:r>
-      <w:proofErr w:type="spellStart"/>
-      <w:r>
-        <w:rPr>
-          <w:rFonts w:ascii="Helvetica Light" w:hAnsi="Helvetica Light" w:cs="Helvetica Light"/>
+          <w:rFonts w:ascii="Times New Roman" w:hAnsi="Times New Roman" w:cs="Times New Roman"/>
+        </w:rPr>
+        <w:t xml:space="preserve"> </w:t>
+      </w:r>
+      <w:proofErr w:type="spellStart"/>
+      <w:r>
+        <w:rPr>
+          <w:rFonts w:ascii="Times New Roman" w:hAnsi="Times New Roman" w:cs="Times New Roman"/>
         </w:rPr>
         <w:t>atau</w:t>
       </w:r>
       <w:proofErr w:type="spellEnd"/>
       <w:r>
         <w:rPr>
-          <w:rFonts w:ascii="Helvetica Light" w:hAnsi="Helvetica Light" w:cs="Helvetica Light"/>
-        </w:rPr>
-        <w:t xml:space="preserve"> edit data di Assets.</w:t>
+          <w:rFonts w:ascii="Times New Roman" w:hAnsi="Times New Roman" w:cs="Times New Roman"/>
+        </w:rPr>
+        <w:t xml:space="preserve"> edit data di </w:t>
+      </w:r>
+      <w:r>
+        <w:rPr>
+          <w:rFonts w:ascii="Times New Roman" w:hAnsi="Times New Roman" w:cs="Times New Roman"/>
+          <w:b/>
+          <w:bCs/>
+          <w:i/>
+          <w:iCs/>
+        </w:rPr>
+        <w:t>Assets</w:t>
+      </w:r>
+      <w:r>
+        <w:rPr>
+          <w:rFonts w:ascii="Times New Roman" w:hAnsi="Times New Roman" w:cs="Times New Roman"/>
+        </w:rPr>
+        <w:t>.</w:t>
       </w:r>
     </w:p>
     <w:p>
@@ -1428,62 +1550,113 @@
           <w:ilvl w:val="0"/>
           <w:numId w:val="2"/>
         </w:numPr>
-      </w:pPr>
-      <w:proofErr w:type="spellStart"/>
-      <w:r>
-        <w:rPr>
-          <w:rFonts w:ascii="Helvetica Light" w:hAnsi="Helvetica Light" w:cs="Helvetica Light"/>
+        <w:rPr>
+          <w:rFonts w:ascii="Times New Roman" w:hAnsi="Times New Roman" w:cs="Times New Roman"/>
+        </w:rPr>
+      </w:pPr>
+      <w:proofErr w:type="spellStart"/>
+      <w:r>
+        <w:rPr>
+          <w:rFonts w:ascii="Times New Roman" w:hAnsi="Times New Roman" w:cs="Times New Roman"/>
         </w:rPr>
         <w:t>Lengkapi</w:t>
       </w:r>
       <w:proofErr w:type="spellEnd"/>
       <w:r>
         <w:rPr>
-          <w:rFonts w:ascii="Helvetica Light" w:hAnsi="Helvetica Light" w:cs="Helvetica Light"/>
-        </w:rPr>
-        <w:t xml:space="preserve"> </w:t>
-      </w:r>
-      <w:proofErr w:type="spellStart"/>
-      <w:r>
-        <w:rPr>
-          <w:rFonts w:ascii="Helvetica Light" w:hAnsi="Helvetica Light" w:cs="Helvetica Light"/>
+          <w:rFonts w:ascii="Times New Roman" w:hAnsi="Times New Roman" w:cs="Times New Roman"/>
+        </w:rPr>
+        <w:t xml:space="preserve"> </w:t>
+      </w:r>
+      <w:proofErr w:type="spellStart"/>
+      <w:r>
+        <w:rPr>
+          <w:rFonts w:ascii="Times New Roman" w:hAnsi="Times New Roman" w:cs="Times New Roman"/>
+        </w:rPr>
+        <w:t>nama</w:t>
+      </w:r>
+      <w:proofErr w:type="spellEnd"/>
+      <w:r>
+        <w:rPr>
+          <w:rFonts w:ascii="Times New Roman" w:hAnsi="Times New Roman" w:cs="Times New Roman"/>
+        </w:rPr>
+        <w:t xml:space="preserve"> asset, </w:t>
+      </w:r>
+      <w:proofErr w:type="spellStart"/>
+      <w:r>
+        <w:rPr>
+          <w:rFonts w:ascii="Times New Roman" w:hAnsi="Times New Roman" w:cs="Times New Roman"/>
+        </w:rPr>
+        <w:t>spesifikasi</w:t>
+      </w:r>
+      <w:proofErr w:type="spellEnd"/>
+      <w:r>
+        <w:rPr>
+          <w:rFonts w:ascii="Times New Roman" w:hAnsi="Times New Roman" w:cs="Times New Roman"/>
+        </w:rPr>
+        <w:t xml:space="preserve"> asset, </w:t>
+      </w:r>
+      <w:proofErr w:type="spellStart"/>
+      <w:r>
+        <w:rPr>
+          <w:rFonts w:ascii="Times New Roman" w:hAnsi="Times New Roman" w:cs="Times New Roman"/>
         </w:rPr>
         <w:t>foto</w:t>
       </w:r>
       <w:proofErr w:type="spellEnd"/>
       <w:r>
         <w:rPr>
-          <w:rFonts w:ascii="Helvetica Light" w:hAnsi="Helvetica Light" w:cs="Helvetica Light"/>
+          <w:rFonts w:ascii="Times New Roman" w:hAnsi="Times New Roman" w:cs="Times New Roman"/>
         </w:rPr>
         <w:t xml:space="preserve">, </w:t>
       </w:r>
       <w:proofErr w:type="spellStart"/>
       <w:r>
         <w:rPr>
-          <w:rFonts w:ascii="Helvetica Light" w:hAnsi="Helvetica Light" w:cs="Helvetica Light"/>
+          <w:rFonts w:ascii="Times New Roman" w:hAnsi="Times New Roman" w:cs="Times New Roman"/>
         </w:rPr>
         <w:t>pengguna</w:t>
       </w:r>
       <w:proofErr w:type="spellEnd"/>
       <w:r>
         <w:rPr>
-          <w:rFonts w:ascii="Helvetica Light" w:hAnsi="Helvetica Light" w:cs="Helvetica Light"/>
+          <w:rFonts w:ascii="Times New Roman" w:hAnsi="Times New Roman" w:cs="Times New Roman"/>
         </w:rPr>
         <w:t xml:space="preserve">, </w:t>
       </w:r>
       <w:proofErr w:type="spellStart"/>
       <w:r>
         <w:rPr>
-          <w:rFonts w:ascii="Helvetica Light" w:hAnsi="Helvetica Light" w:cs="Helvetica Light"/>
+          <w:rFonts w:ascii="Times New Roman" w:hAnsi="Times New Roman" w:cs="Times New Roman"/>
         </w:rPr>
         <w:t>lokasi</w:t>
       </w:r>
       <w:proofErr w:type="spellEnd"/>
       <w:r>
         <w:rPr>
-          <w:rFonts w:ascii="Helvetica Light" w:hAnsi="Helvetica Light" w:cs="Helvetica Light"/>
-        </w:rPr>
-        <w:t>, dan status.</w:t>
+          <w:rFonts w:ascii="Times New Roman" w:hAnsi="Times New Roman" w:cs="Times New Roman"/>
+        </w:rPr>
+        <w:t>, dan status</w:t>
+      </w:r>
+      <w:r>
+        <w:rPr>
+          <w:rFonts w:ascii="Times New Roman" w:hAnsi="Times New Roman" w:cs="Times New Roman"/>
+        </w:rPr>
+        <w:t xml:space="preserve">, </w:t>
+      </w:r>
+      <w:proofErr w:type="spellStart"/>
+      <w:r>
+        <w:rPr>
+          <w:rFonts w:ascii="Times New Roman" w:hAnsi="Times New Roman" w:cs="Times New Roman"/>
+        </w:rPr>
+        <w:t>dll</w:t>
+      </w:r>
+      <w:proofErr w:type="spellEnd"/>
+      <w:r>
+        <w:rPr>
+          <w:rFonts w:ascii="Times New Roman" w:hAnsi="Times New Roman" w:cs="Times New Roman"/>
+        </w:rPr>
+        <w:t>.</w:t>
       </w:r>
     </w:p>
     <w:p>
@@ -1493,24 +1666,29 @@
           <w:ilvl w:val="0"/>
           <w:numId w:val="2"/>
         </w:numPr>
-      </w:pPr>
-      <w:proofErr w:type="spellStart"/>
-      <w:r>
-        <w:rPr>
-          <w:rFonts w:ascii="Helvetica Light" w:hAnsi="Helvetica Light" w:cs="Helvetica Light"/>
+        <w:rPr>
+          <w:rFonts w:ascii="Times New Roman" w:hAnsi="Times New Roman" w:cs="Times New Roman"/>
+        </w:rPr>
+      </w:pPr>
+      <w:proofErr w:type="spellStart"/>
+      <w:r>
+        <w:rPr>
+          <w:rFonts w:ascii="Times New Roman" w:hAnsi="Times New Roman" w:cs="Times New Roman"/>
         </w:rPr>
         <w:t>Tambahkan</w:t>
       </w:r>
       <w:proofErr w:type="spellEnd"/>
       <w:r>
         <w:rPr>
-          <w:rFonts w:ascii="Helvetica Light" w:hAnsi="Helvetica Light" w:cs="Helvetica Light"/>
-        </w:rPr>
-        <w:t xml:space="preserve"> </w:t>
-      </w:r>
-      <w:r>
-        <w:rPr>
-          <w:rFonts w:ascii="Helvetica Light" w:hAnsi="Helvetica Light" w:cs="Helvetica Light"/>
+          <w:rFonts w:ascii="Times New Roman" w:hAnsi="Times New Roman" w:cs="Times New Roman"/>
+        </w:rPr>
+        <w:t xml:space="preserve"> </w:t>
+      </w:r>
+      <w:r>
+        <w:rPr>
+          <w:rFonts w:ascii="Times New Roman" w:hAnsi="Times New Roman" w:cs="Times New Roman"/>
+          <w:b/>
+          <w:bCs/>
           <w:i/>
           <w:iCs/>
         </w:rPr>
@@ -1518,63 +1696,63 @@
       </w:r>
       <w:r>
         <w:rPr>
-          <w:rFonts w:ascii="Helvetica Light" w:hAnsi="Helvetica Light" w:cs="Helvetica Light"/>
-        </w:rPr>
-        <w:t xml:space="preserve"> </w:t>
-      </w:r>
-      <w:proofErr w:type="spellStart"/>
-      <w:r>
-        <w:rPr>
-          <w:rFonts w:ascii="Helvetica Light" w:hAnsi="Helvetica Light" w:cs="Helvetica Light"/>
+          <w:rFonts w:ascii="Times New Roman" w:hAnsi="Times New Roman" w:cs="Times New Roman"/>
+        </w:rPr>
+        <w:t xml:space="preserve"> </w:t>
+      </w:r>
+      <w:proofErr w:type="spellStart"/>
+      <w:r>
+        <w:rPr>
+          <w:rFonts w:ascii="Times New Roman" w:hAnsi="Times New Roman" w:cs="Times New Roman"/>
         </w:rPr>
         <w:t>bila</w:t>
       </w:r>
       <w:proofErr w:type="spellEnd"/>
       <w:r>
         <w:rPr>
-          <w:rFonts w:ascii="Helvetica Light" w:hAnsi="Helvetica Light" w:cs="Helvetica Light"/>
-        </w:rPr>
-        <w:t xml:space="preserve"> </w:t>
-      </w:r>
-      <w:proofErr w:type="spellStart"/>
-      <w:r>
-        <w:rPr>
-          <w:rFonts w:ascii="Helvetica Light" w:hAnsi="Helvetica Light" w:cs="Helvetica Light"/>
+          <w:rFonts w:ascii="Times New Roman" w:hAnsi="Times New Roman" w:cs="Times New Roman"/>
+        </w:rPr>
+        <w:t xml:space="preserve"> </w:t>
+      </w:r>
+      <w:proofErr w:type="spellStart"/>
+      <w:r>
+        <w:rPr>
+          <w:rFonts w:ascii="Times New Roman" w:hAnsi="Times New Roman" w:cs="Times New Roman"/>
         </w:rPr>
         <w:t>ada</w:t>
       </w:r>
       <w:proofErr w:type="spellEnd"/>
       <w:r>
         <w:rPr>
-          <w:rFonts w:ascii="Helvetica Light" w:hAnsi="Helvetica Light" w:cs="Helvetica Light"/>
+          <w:rFonts w:ascii="Times New Roman" w:hAnsi="Times New Roman" w:cs="Times New Roman"/>
         </w:rPr>
         <w:t xml:space="preserve"> maintenance </w:t>
       </w:r>
       <w:proofErr w:type="spellStart"/>
       <w:r>
         <w:rPr>
-          <w:rFonts w:ascii="Helvetica Light" w:hAnsi="Helvetica Light" w:cs="Helvetica Light"/>
+          <w:rFonts w:ascii="Times New Roman" w:hAnsi="Times New Roman" w:cs="Times New Roman"/>
         </w:rPr>
         <w:t>atau</w:t>
       </w:r>
       <w:proofErr w:type="spellEnd"/>
       <w:r>
         <w:rPr>
-          <w:rFonts w:ascii="Helvetica Light" w:hAnsi="Helvetica Light" w:cs="Helvetica Light"/>
-        </w:rPr>
-        <w:t xml:space="preserve"> </w:t>
-      </w:r>
-      <w:proofErr w:type="spellStart"/>
-      <w:r>
-        <w:rPr>
-          <w:rFonts w:ascii="Helvetica Light" w:hAnsi="Helvetica Light" w:cs="Helvetica Light"/>
+          <w:rFonts w:ascii="Times New Roman" w:hAnsi="Times New Roman" w:cs="Times New Roman"/>
+        </w:rPr>
+        <w:t xml:space="preserve"> </w:t>
+      </w:r>
+      <w:proofErr w:type="spellStart"/>
+      <w:r>
+        <w:rPr>
+          <w:rFonts w:ascii="Times New Roman" w:hAnsi="Times New Roman" w:cs="Times New Roman"/>
         </w:rPr>
         <w:t>perpindahan</w:t>
       </w:r>
       <w:proofErr w:type="spellEnd"/>
       <w:r>
         <w:rPr>
-          <w:rFonts w:ascii="Helvetica Light" w:hAnsi="Helvetica Light" w:cs="Helvetica Light"/>
+          <w:rFonts w:ascii="Times New Roman" w:hAnsi="Times New Roman" w:cs="Times New Roman"/>
         </w:rPr>
         <w:t>.</w:t>
       </w:r>
@@ -1586,74 +1764,77 @@
           <w:ilvl w:val="0"/>
           <w:numId w:val="2"/>
         </w:numPr>
-      </w:pPr>
-      <w:proofErr w:type="spellStart"/>
-      <w:r>
-        <w:rPr>
-          <w:rFonts w:ascii="Helvetica Light" w:hAnsi="Helvetica Light" w:cs="Helvetica Light"/>
+        <w:rPr>
+          <w:rFonts w:ascii="Times New Roman" w:hAnsi="Times New Roman" w:cs="Times New Roman"/>
+        </w:rPr>
+      </w:pPr>
+      <w:proofErr w:type="spellStart"/>
+      <w:r>
+        <w:rPr>
+          <w:rFonts w:ascii="Times New Roman" w:hAnsi="Times New Roman" w:cs="Times New Roman"/>
         </w:rPr>
         <w:t>Cetak</w:t>
       </w:r>
       <w:proofErr w:type="spellEnd"/>
       <w:r>
         <w:rPr>
-          <w:rFonts w:ascii="Helvetica Light" w:hAnsi="Helvetica Light" w:cs="Helvetica Light"/>
+          <w:rFonts w:ascii="Times New Roman" w:hAnsi="Times New Roman" w:cs="Times New Roman"/>
         </w:rPr>
         <w:t xml:space="preserve"> QR </w:t>
       </w:r>
       <w:proofErr w:type="spellStart"/>
       <w:r>
         <w:rPr>
-          <w:rFonts w:ascii="Helvetica Light" w:hAnsi="Helvetica Light" w:cs="Helvetica Light"/>
+          <w:rFonts w:ascii="Times New Roman" w:hAnsi="Times New Roman" w:cs="Times New Roman"/>
         </w:rPr>
         <w:t>atau</w:t>
       </w:r>
       <w:proofErr w:type="spellEnd"/>
       <w:r>
         <w:rPr>
-          <w:rFonts w:ascii="Helvetica Light" w:hAnsi="Helvetica Light" w:cs="Helvetica Light"/>
+          <w:rFonts w:ascii="Times New Roman" w:hAnsi="Times New Roman" w:cs="Times New Roman"/>
         </w:rPr>
         <w:t xml:space="preserve"> label </w:t>
       </w:r>
       <w:proofErr w:type="spellStart"/>
       <w:r>
         <w:rPr>
-          <w:rFonts w:ascii="Helvetica Light" w:hAnsi="Helvetica Light" w:cs="Helvetica Light"/>
+          <w:rFonts w:ascii="Times New Roman" w:hAnsi="Times New Roman" w:cs="Times New Roman"/>
         </w:rPr>
         <w:t>untuk</w:t>
       </w:r>
       <w:proofErr w:type="spellEnd"/>
       <w:r>
         <w:rPr>
-          <w:rFonts w:ascii="Helvetica Light" w:hAnsi="Helvetica Light" w:cs="Helvetica Light"/>
-        </w:rPr>
-        <w:t xml:space="preserve"> </w:t>
-      </w:r>
-      <w:proofErr w:type="spellStart"/>
-      <w:r>
-        <w:rPr>
-          <w:rFonts w:ascii="Helvetica Light" w:hAnsi="Helvetica Light" w:cs="Helvetica Light"/>
+          <w:rFonts w:ascii="Times New Roman" w:hAnsi="Times New Roman" w:cs="Times New Roman"/>
+        </w:rPr>
+        <w:t xml:space="preserve"> </w:t>
+      </w:r>
+      <w:proofErr w:type="spellStart"/>
+      <w:r>
+        <w:rPr>
+          <w:rFonts w:ascii="Times New Roman" w:hAnsi="Times New Roman" w:cs="Times New Roman"/>
         </w:rPr>
         <w:t>ditempel</w:t>
       </w:r>
       <w:proofErr w:type="spellEnd"/>
       <w:r>
         <w:rPr>
-          <w:rFonts w:ascii="Helvetica Light" w:hAnsi="Helvetica Light" w:cs="Helvetica Light"/>
+          <w:rFonts w:ascii="Times New Roman" w:hAnsi="Times New Roman" w:cs="Times New Roman"/>
         </w:rPr>
         <w:t xml:space="preserve"> pada </w:t>
       </w:r>
       <w:proofErr w:type="spellStart"/>
       <w:r>
         <w:rPr>
-          <w:rFonts w:ascii="Helvetica Light" w:hAnsi="Helvetica Light" w:cs="Helvetica Light"/>
+          <w:rFonts w:ascii="Times New Roman" w:hAnsi="Times New Roman" w:cs="Times New Roman"/>
         </w:rPr>
         <w:t>barang</w:t>
       </w:r>
       <w:proofErr w:type="spellEnd"/>
       <w:r>
         <w:rPr>
-          <w:rFonts w:ascii="Helvetica Light" w:hAnsi="Helvetica Light" w:cs="Helvetica Light"/>
+          <w:rFonts w:ascii="Times New Roman" w:hAnsi="Times New Roman" w:cs="Times New Roman"/>
         </w:rPr>
         <w:t>.</w:t>
       </w:r>
@@ -1665,60 +1846,79 @@
           <w:ilvl w:val="0"/>
           <w:numId w:val="2"/>
         </w:numPr>
-      </w:pPr>
-      <w:proofErr w:type="spellStart"/>
-      <w:r>
-        <w:rPr>
-          <w:rFonts w:ascii="Helvetica Light" w:hAnsi="Helvetica Light" w:cs="Helvetica Light"/>
+        <w:rPr>
+          <w:rFonts w:ascii="Times New Roman" w:hAnsi="Times New Roman" w:cs="Times New Roman"/>
+        </w:rPr>
+      </w:pPr>
+      <w:proofErr w:type="spellStart"/>
+      <w:r>
+        <w:rPr>
+          <w:rFonts w:ascii="Times New Roman" w:hAnsi="Times New Roman" w:cs="Times New Roman"/>
         </w:rPr>
         <w:t>Gunakan</w:t>
       </w:r>
       <w:proofErr w:type="spellEnd"/>
       <w:r>
         <w:rPr>
-          <w:rFonts w:ascii="Helvetica Light" w:hAnsi="Helvetica Light" w:cs="Helvetica Light"/>
-        </w:rPr>
-        <w:t xml:space="preserve"> export </w:t>
-      </w:r>
-      <w:proofErr w:type="spellStart"/>
-      <w:r>
-        <w:rPr>
-          <w:rFonts w:ascii="Helvetica Light" w:hAnsi="Helvetica Light" w:cs="Helvetica Light"/>
+          <w:rFonts w:ascii="Times New Roman" w:hAnsi="Times New Roman" w:cs="Times New Roman"/>
+        </w:rPr>
+        <w:t xml:space="preserve"> </w:t>
+      </w:r>
+      <w:r>
+        <w:rPr>
+          <w:rFonts w:ascii="Times New Roman" w:hAnsi="Times New Roman" w:cs="Times New Roman"/>
+          <w:b/>
+          <w:bCs/>
+          <w:i/>
+          <w:iCs/>
+        </w:rPr>
+        <w:t>export</w:t>
+      </w:r>
+      <w:r>
+        <w:rPr>
+          <w:rFonts w:ascii="Times New Roman" w:hAnsi="Times New Roman" w:cs="Times New Roman"/>
+        </w:rPr>
+        <w:t xml:space="preserve"> </w:t>
+      </w:r>
+      <w:proofErr w:type="spellStart"/>
+      <w:r>
+        <w:rPr>
+          <w:rFonts w:ascii="Times New Roman" w:hAnsi="Times New Roman" w:cs="Times New Roman"/>
         </w:rPr>
         <w:t>bila</w:t>
       </w:r>
       <w:proofErr w:type="spellEnd"/>
       <w:r>
         <w:rPr>
-          <w:rFonts w:ascii="Helvetica Light" w:hAnsi="Helvetica Light" w:cs="Helvetica Light"/>
-        </w:rPr>
-        <w:t xml:space="preserve"> </w:t>
-      </w:r>
-      <w:proofErr w:type="spellStart"/>
-      <w:r>
-        <w:rPr>
-          <w:rFonts w:ascii="Helvetica Light" w:hAnsi="Helvetica Light" w:cs="Helvetica Light"/>
+          <w:rFonts w:ascii="Times New Roman" w:hAnsi="Times New Roman" w:cs="Times New Roman"/>
+        </w:rPr>
+        <w:t xml:space="preserve"> </w:t>
+      </w:r>
+      <w:proofErr w:type="spellStart"/>
+      <w:r>
+        <w:rPr>
+          <w:rFonts w:ascii="Times New Roman" w:hAnsi="Times New Roman" w:cs="Times New Roman"/>
         </w:rPr>
         <w:t>perlu</w:t>
       </w:r>
       <w:proofErr w:type="spellEnd"/>
       <w:r>
         <w:rPr>
-          <w:rFonts w:ascii="Helvetica Light" w:hAnsi="Helvetica Light" w:cs="Helvetica Light"/>
-        </w:rPr>
-        <w:t xml:space="preserve"> </w:t>
-      </w:r>
-      <w:proofErr w:type="spellStart"/>
-      <w:r>
-        <w:rPr>
-          <w:rFonts w:ascii="Helvetica Light" w:hAnsi="Helvetica Light" w:cs="Helvetica Light"/>
+          <w:rFonts w:ascii="Times New Roman" w:hAnsi="Times New Roman" w:cs="Times New Roman"/>
+        </w:rPr>
+        <w:t xml:space="preserve"> </w:t>
+      </w:r>
+      <w:proofErr w:type="spellStart"/>
+      <w:r>
+        <w:rPr>
+          <w:rFonts w:ascii="Times New Roman" w:hAnsi="Times New Roman" w:cs="Times New Roman"/>
         </w:rPr>
         <w:t>laporan</w:t>
       </w:r>
       <w:proofErr w:type="spellEnd"/>
       <w:r>
         <w:rPr>
-          <w:rFonts w:ascii="Helvetica Light" w:hAnsi="Helvetica Light" w:cs="Helvetica Light"/>
+          <w:rFonts w:ascii="Times New Roman" w:hAnsi="Times New Roman" w:cs="Times New Roman"/>
         </w:rPr>
         <w:t>.</w:t>
       </w:r>
@@ -1730,13 +1930,37 @@
           <w:ilvl w:val="0"/>
           <w:numId w:val="2"/>
         </w:numPr>
-      </w:pPr>
-      <w:r>
-        <w:rPr>
-          <w:rFonts w:ascii="Helvetica Light" w:hAnsi="Helvetica Light" w:cs="Helvetica Light"/>
+        <w:rPr>
+          <w:rFonts w:ascii="Times New Roman" w:hAnsi="Times New Roman" w:cs="Times New Roman"/>
+        </w:rPr>
+      </w:pPr>
+      <w:r>
+        <w:rPr>
+          <w:rFonts w:ascii="Times New Roman" w:hAnsi="Times New Roman" w:cs="Times New Roman"/>
         </w:rPr>
         <w:t>Logout.</w:t>
       </w:r>
+    </w:p>
+    <w:p>
+      <w:pPr>
+        <w:rPr>
+          <w:rFonts w:ascii="Times New Roman" w:hAnsi="Times New Roman" w:cs="Times New Roman"/>
+        </w:rPr>
+      </w:pPr>
+    </w:p>
+    <w:p>
+      <w:pPr>
+        <w:rPr>
+          <w:rFonts w:ascii="Times New Roman" w:hAnsi="Times New Roman" w:cs="Times New Roman"/>
+        </w:rPr>
+      </w:pPr>
+    </w:p>
+    <w:p>
+      <w:pPr>
+        <w:rPr>
+          <w:rFonts w:ascii="Times New Roman" w:hAnsi="Times New Roman" w:cs="Times New Roman"/>
+        </w:rPr>
+      </w:pPr>
     </w:p>
     <w:sectPr>
       <w:pgSz w:w="12240" w:h="15840"/>
@@ -1752,8 +1976,8 @@
   <w:abstractNum w:abstractNumId="0" w15:restartNumberingAfterBreak="0">
     <w:nsid w:val="242B2DC3"/>
     <w:multiLevelType w:val="hybridMultilevel"/>
-    <w:tmpl w:val="A2D8E4B6"/>
-    <w:lvl w:ilvl="0" w:tplc="EC74B32E">
+    <w:tmpl w:val="6DEA250C"/>
+    <w:lvl w:ilvl="0" w:tplc="9F5064EA">
       <w:start w:val="1"/>
       <w:numFmt w:val="decimal"/>
       <w:lvlText w:val="%1."/>
@@ -1762,7 +1986,7 @@
         <w:ind w:left="720" w:hanging="360"/>
       </w:pPr>
       <w:rPr>
-        <w:rFonts w:ascii="Helvetica Light" w:hAnsi="Helvetica Light" w:cs="Helvetica Light" w:hint="default"/>
+        <w:rFonts w:asciiTheme="minorHAnsi" w:hAnsiTheme="minorHAnsi" w:cstheme="minorHAnsi" w:hint="default"/>
       </w:rPr>
     </w:lvl>
     <w:lvl w:ilvl="1" w:tplc="04090019" w:tentative="1">

</xml_diff>